<commit_message>
Install guide: add Part 10 — disaster recovery runbook
Covers the off-server backup habit (grain-backup + SFTP the dump down),
the full post-wipe rebuild (fresh VPS -> current installer from GitHub ->
restore the mysqldump into the fresh MySQL -> re-set the app admin
password), and what survives only on the office portal if no dump was
kept. Docx regenerated to match.
</commit_message>
<xml_diff>
--- a/Grain-Tracker-Install-Guide.docx
+++ b/Grain-Tracker-Install-Guide.docx
@@ -3305,7 +3305,181 @@
           <w:sz w:val="22"/>
           <w:szCs w:val="22"/>
         </w:rPr>
-        <w:t xml:space="preserve">).</w:t>
+        <w:t xml:space="preserve">). Note: while</w:t>
+      </w:r>
+    </w:p>
+    <w:p>
+      <w:pPr>
+        <w:spacing w:after="100" w:line="300"/>
+      </w:pPr>
+      <w:r>
+        <w:rPr>
+          <w:rFonts w:ascii="Calibri" w:cs="Calibri" w:eastAsia="Calibri" w:hAnsi="Calibri"/>
+          <w:b w:val="false"/>
+          <w:bCs w:val="false"/>
+          <w:i w:val="false"/>
+          <w:iCs w:val="false"/>
+          <w:sz w:val="22"/>
+          <w:szCs w:val="22"/>
+        </w:rPr>
+        <w:t xml:space="preserve">   </w:t>
+      </w:r>
+      <w:r>
+        <w:rPr>
+          <w:rFonts w:ascii="Courier New" w:cs="Courier New" w:eastAsia="Courier New" w:hAnsi="Courier New"/>
+          <w:b w:val="false"/>
+          <w:bCs w:val="false"/>
+          <w:i w:val="false"/>
+          <w:iCs w:val="false"/>
+          <w:sz w:val="20"/>
+          <w:szCs w:val="20"/>
+        </w:rPr>
+        <w:t xml:space="preserve">ADMIN_PASSWORD</w:t>
+      </w:r>
+      <w:r>
+        <w:rPr>
+          <w:rFonts w:ascii="Calibri" w:cs="Calibri" w:eastAsia="Calibri" w:hAnsi="Calibri"/>
+          <w:b w:val="false"/>
+          <w:bCs w:val="false"/>
+          <w:i w:val="false"/>
+          <w:iCs w:val="false"/>
+          <w:sz w:val="22"/>
+          <w:szCs w:val="22"/>
+        </w:rPr>
+        <w:t xml:space="preserve"> is unset or left at the default </w:t>
+      </w:r>
+      <w:r>
+        <w:rPr>
+          <w:rFonts w:ascii="Courier New" w:cs="Courier New" w:eastAsia="Courier New" w:hAnsi="Courier New"/>
+          <w:b w:val="false"/>
+          <w:bCs w:val="false"/>
+          <w:i w:val="false"/>
+          <w:iCs w:val="false"/>
+          <w:sz w:val="20"/>
+          <w:szCs w:val="20"/>
+        </w:rPr>
+        <w:t xml:space="preserve">grain-admin</w:t>
+      </w:r>
+      <w:r>
+        <w:rPr>
+          <w:rFonts w:ascii="Calibri" w:cs="Calibri" w:eastAsia="Calibri" w:hAnsi="Calibri"/>
+          <w:b w:val="false"/>
+          <w:bCs w:val="false"/>
+          <w:i w:val="false"/>
+          <w:iCs w:val="false"/>
+          <w:sz w:val="22"/>
+          <w:szCs w:val="22"/>
+        </w:rPr>
+        <w:t xml:space="preserve">, the app's</w:t>
+      </w:r>
+    </w:p>
+    <w:p>
+      <w:pPr>
+        <w:spacing w:after="100" w:line="300"/>
+      </w:pPr>
+      <w:r>
+        <w:rPr>
+          <w:rFonts w:ascii="Calibri" w:cs="Calibri" w:eastAsia="Calibri" w:hAnsi="Calibri"/>
+          <w:b w:val="false"/>
+          <w:bCs w:val="false"/>
+          <w:i w:val="false"/>
+          <w:iCs w:val="false"/>
+          <w:sz w:val="22"/>
+          <w:szCs w:val="22"/>
+        </w:rPr>
+        <w:t xml:space="preserve">   admin gate is OPEN and admin actions (sites, farmers, lots, bins, sync</w:t>
+      </w:r>
+    </w:p>
+    <w:p>
+      <w:pPr>
+        <w:spacing w:after="100" w:line="300"/>
+      </w:pPr>
+      <w:r>
+        <w:rPr>
+          <w:rFonts w:ascii="Calibri" w:cs="Calibri" w:eastAsia="Calibri" w:hAnsi="Calibri"/>
+          <w:b w:val="false"/>
+          <w:bCs w:val="false"/>
+          <w:i w:val="false"/>
+          <w:iCs w:val="false"/>
+          <w:sz w:val="22"/>
+          <w:szCs w:val="22"/>
+        </w:rPr>
+        <w:t xml:space="preserve">   settings) ask for no password at all — the generated non-default password</w:t>
+      </w:r>
+    </w:p>
+    <w:p>
+      <w:pPr>
+        <w:spacing w:after="100" w:line="300"/>
+      </w:pPr>
+      <w:r>
+        <w:rPr>
+          <w:rFonts w:ascii="Calibri" w:cs="Calibri" w:eastAsia="Calibri" w:hAnsi="Calibri"/>
+          <w:b w:val="false"/>
+          <w:bCs w:val="false"/>
+          <w:i w:val="false"/>
+          <w:iCs w:val="false"/>
+          <w:sz w:val="22"/>
+          <w:szCs w:val="22"/>
+        </w:rPr>
+        <w:t xml:space="preserve">   is what turns the gate on. Step 7 also prints a </w:t>
+      </w:r>
+      <w:r>
+        <w:rPr>
+          <w:rFonts w:ascii="Calibri" w:cs="Calibri" w:eastAsia="Calibri" w:hAnsi="Calibri"/>
+          <w:b/>
+          <w:bCs/>
+          <w:i w:val="false"/>
+          <w:iCs w:val="false"/>
+          <w:sz w:val="22"/>
+          <w:szCs w:val="22"/>
+        </w:rPr>
+        <w:t xml:space="preserve">SYNC_KEY</w:t>
+      </w:r>
+      <w:r>
+        <w:rPr>
+          <w:rFonts w:ascii="Calibri" w:cs="Calibri" w:eastAsia="Calibri" w:hAnsi="Calibri"/>
+          <w:b w:val="false"/>
+          <w:bCs w:val="false"/>
+          <w:i w:val="false"/>
+          <w:iCs w:val="false"/>
+          <w:sz w:val="22"/>
+          <w:szCs w:val="22"/>
+        </w:rPr>
+        <w:t xml:space="preserve">: save it too —</w:t>
+      </w:r>
+    </w:p>
+    <w:p>
+      <w:pPr>
+        <w:spacing w:after="100" w:line="300"/>
+      </w:pPr>
+      <w:r>
+        <w:rPr>
+          <w:rFonts w:ascii="Calibri" w:cs="Calibri" w:eastAsia="Calibri" w:hAnsi="Calibri"/>
+          <w:b w:val="false"/>
+          <w:bCs w:val="false"/>
+          <w:i w:val="false"/>
+          <w:iCs w:val="false"/>
+          <w:sz w:val="22"/>
+          <w:szCs w:val="22"/>
+        </w:rPr>
+        <w:t xml:space="preserve">   it's the shared secret the main-office portal requires before it accepts</w:t>
+      </w:r>
+    </w:p>
+    <w:p>
+      <w:pPr>
+        <w:spacing w:after="100" w:line="300"/>
+      </w:pPr>
+      <w:r>
+        <w:rPr>
+          <w:rFonts w:ascii="Calibri" w:cs="Calibri" w:eastAsia="Calibri" w:hAnsi="Calibri"/>
+          <w:b w:val="false"/>
+          <w:bCs w:val="false"/>
+          <w:i w:val="false"/>
+          <w:iCs w:val="false"/>
+          <w:sz w:val="22"/>
+          <w:szCs w:val="22"/>
+        </w:rPr>
+        <w:t xml:space="preserve">   any end-of-day sync (the office refuses all syncs without it).</w:t>
       </w:r>
     </w:p>
     <w:p>
@@ -6502,6 +6676,90 @@
                 <w:sz w:val="20"/>
                 <w:szCs w:val="20"/>
               </w:rPr>
+              <w:t xml:space="preserve">Find the office sync key (</w:t>
+            </w:r>
+            <w:r>
+              <w:rPr>
+                <w:rFonts w:ascii="Courier New" w:cs="Courier New" w:eastAsia="Courier New" w:hAnsi="Courier New"/>
+                <w:b w:val="false"/>
+                <w:bCs w:val="false"/>
+                <w:i w:val="false"/>
+                <w:iCs w:val="false"/>
+                <w:sz w:val="18"/>
+                <w:szCs w:val="18"/>
+              </w:rPr>
+              <w:t xml:space="preserve">SYNC_KEY</w:t>
+            </w:r>
+            <w:r>
+              <w:rPr>
+                <w:rFonts w:ascii="Calibri" w:cs="Calibri" w:eastAsia="Calibri" w:hAnsi="Calibri"/>
+                <w:b w:val="false"/>
+                <w:bCs w:val="false"/>
+                <w:i w:val="false"/>
+                <w:iCs w:val="false"/>
+                <w:sz w:val="20"/>
+                <w:szCs w:val="20"/>
+              </w:rPr>
+              <w:t xml:space="preserve">)</w:t>
+            </w:r>
+          </w:p>
+        </w:tc>
+        <w:tc>
+          <w:tcPr>
+            <w:tcMar>
+              <w:top w:type="dxa" w:w="60"/>
+              <w:left w:type="dxa" w:w="100"/>
+              <w:bottom w:type="dxa" w:w="60"/>
+              <w:right w:type="dxa" w:w="100"/>
+            </w:tcMar>
+          </w:tcPr>
+          <w:p>
+            <w:pPr>
+              <w:spacing w:line="276"/>
+            </w:pPr>
+            <w:r>
+              <w:rPr>
+                <w:rFonts w:ascii="Courier New" w:cs="Courier New" w:eastAsia="Courier New" w:hAnsi="Courier New"/>
+                <w:b w:val="false"/>
+                <w:bCs w:val="false"/>
+                <w:i w:val="false"/>
+                <w:iCs w:val="false"/>
+                <w:sz w:val="18"/>
+                <w:szCs w:val="18"/>
+              </w:rPr>
+              <w:t xml:space="preserve">sudo grep SYNC_KEY /opt/gtv9-deploy/.env</w:t>
+            </w:r>
+          </w:p>
+        </w:tc>
+      </w:tr>
+      <w:tr>
+        <w:trPr>
+          <w:cantSplit/>
+          <w:tblHeader w:val="false"/>
+        </w:trPr>
+        <w:tc>
+          <w:tcPr>
+            <w:tcMar>
+              <w:top w:type="dxa" w:w="60"/>
+              <w:left w:type="dxa" w:w="100"/>
+              <w:bottom w:type="dxa" w:w="60"/>
+              <w:right w:type="dxa" w:w="100"/>
+            </w:tcMar>
+          </w:tcPr>
+          <w:p>
+            <w:pPr>
+              <w:spacing w:line="276"/>
+            </w:pPr>
+            <w:r>
+              <w:rPr>
+                <w:rFonts w:ascii="Calibri" w:cs="Calibri" w:eastAsia="Calibri" w:hAnsi="Calibri"/>
+                <w:b w:val="false"/>
+                <w:bCs w:val="false"/>
+                <w:i w:val="false"/>
+                <w:iCs w:val="false"/>
+                <w:sz w:val="20"/>
+                <w:szCs w:val="20"/>
+              </w:rPr>
               <w:t xml:space="preserve">Manual database backup</w:t>
             </w:r>
           </w:p>
@@ -7610,7 +7868,7 @@
                 <w:sz w:val="20"/>
                 <w:szCs w:val="20"/>
               </w:rPr>
-              <w:t xml:space="preserve">Use the APP admin password from Part 4 (</w:t>
+              <w:t xml:space="preserve">The admin gate is only on when </w:t>
             </w:r>
             <w:r>
               <w:rPr>
@@ -7622,7 +7880,7 @@
                 <w:sz w:val="18"/>
                 <w:szCs w:val="18"/>
               </w:rPr>
-              <w:t xml:space="preserve">sudo grep ADMIN_PASSWORD /opt/gtv9-deploy/.env</w:t>
+              <w:t xml:space="preserve">ADMIN_PASSWORD</w:t>
             </w:r>
             <w:r>
               <w:rPr>
@@ -7634,7 +7892,103 @@
                 <w:sz w:val="20"/>
                 <w:szCs w:val="20"/>
               </w:rPr>
-              <w:t xml:space="preserve">). Five wrong tries lock it out for a minute.</w:t>
+              <w:t xml:space="preserve"> in </w:t>
+            </w:r>
+            <w:r>
+              <w:rPr>
+                <w:rFonts w:ascii="Courier New" w:cs="Courier New" w:eastAsia="Courier New" w:hAnsi="Courier New"/>
+                <w:b w:val="false"/>
+                <w:bCs w:val="false"/>
+                <w:i w:val="false"/>
+                <w:iCs w:val="false"/>
+                <w:sz w:val="18"/>
+                <w:szCs w:val="18"/>
+              </w:rPr>
+              <w:t xml:space="preserve">/opt/gtv9-deploy/.env</w:t>
+            </w:r>
+            <w:r>
+              <w:rPr>
+                <w:rFonts w:ascii="Calibri" w:cs="Calibri" w:eastAsia="Calibri" w:hAnsi="Calibri"/>
+                <w:b w:val="false"/>
+                <w:bCs w:val="false"/>
+                <w:i w:val="false"/>
+                <w:iCs w:val="false"/>
+                <w:sz w:val="20"/>
+                <w:szCs w:val="20"/>
+              </w:rPr>
+              <w:t xml:space="preserve"> is set to a non-default value. Use that password (</w:t>
+            </w:r>
+            <w:r>
+              <w:rPr>
+                <w:rFonts w:ascii="Courier New" w:cs="Courier New" w:eastAsia="Courier New" w:hAnsi="Courier New"/>
+                <w:b w:val="false"/>
+                <w:bCs w:val="false"/>
+                <w:i w:val="false"/>
+                <w:iCs w:val="false"/>
+                <w:sz w:val="18"/>
+                <w:szCs w:val="18"/>
+              </w:rPr>
+              <w:t xml:space="preserve">sudo grep ADMIN_PASSWORD /opt/gtv9-deploy/.env</w:t>
+            </w:r>
+            <w:r>
+              <w:rPr>
+                <w:rFonts w:ascii="Calibri" w:cs="Calibri" w:eastAsia="Calibri" w:hAnsi="Calibri"/>
+                <w:b w:val="false"/>
+                <w:bCs w:val="false"/>
+                <w:i w:val="false"/>
+                <w:iCs w:val="false"/>
+                <w:sz w:val="20"/>
+                <w:szCs w:val="20"/>
+              </w:rPr>
+              <w:t xml:space="preserve">); five wrong tries lock it out for a minute. To open the gate (no password asked), remove the variable or set it to </w:t>
+            </w:r>
+            <w:r>
+              <w:rPr>
+                <w:rFonts w:ascii="Courier New" w:cs="Courier New" w:eastAsia="Courier New" w:hAnsi="Courier New"/>
+                <w:b w:val="false"/>
+                <w:bCs w:val="false"/>
+                <w:i w:val="false"/>
+                <w:iCs w:val="false"/>
+                <w:sz w:val="18"/>
+                <w:szCs w:val="18"/>
+              </w:rPr>
+              <w:t xml:space="preserve">grain-admin</w:t>
+            </w:r>
+            <w:r>
+              <w:rPr>
+                <w:rFonts w:ascii="Calibri" w:cs="Calibri" w:eastAsia="Calibri" w:hAnsi="Calibri"/>
+                <w:b w:val="false"/>
+                <w:bCs w:val="false"/>
+                <w:i w:val="false"/>
+                <w:iCs w:val="false"/>
+                <w:sz w:val="20"/>
+                <w:szCs w:val="20"/>
+              </w:rPr>
+              <w:t xml:space="preserve"> and </w:t>
+            </w:r>
+            <w:r>
+              <w:rPr>
+                <w:rFonts w:ascii="Courier New" w:cs="Courier New" w:eastAsia="Courier New" w:hAnsi="Courier New"/>
+                <w:b w:val="false"/>
+                <w:bCs w:val="false"/>
+                <w:i w:val="false"/>
+                <w:iCs w:val="false"/>
+                <w:sz w:val="18"/>
+                <w:szCs w:val="18"/>
+              </w:rPr>
+              <w:t xml:space="preserve">docker compose restart app</w:t>
+            </w:r>
+            <w:r>
+              <w:rPr>
+                <w:rFonts w:ascii="Calibri" w:cs="Calibri" w:eastAsia="Calibri" w:hAnsi="Calibri"/>
+                <w:b w:val="false"/>
+                <w:bCs w:val="false"/>
+                <w:i w:val="false"/>
+                <w:iCs w:val="false"/>
+                <w:sz w:val="20"/>
+                <w:szCs w:val="20"/>
+              </w:rPr>
+              <w:t xml:space="preserve">.</w:t>
             </w:r>
           </w:p>
         </w:tc>
@@ -7667,7 +8021,7 @@
                 <w:sz w:val="20"/>
                 <w:szCs w:val="20"/>
               </w:rPr>
-              <w:t xml:space="preserve">Can't log in as root anymore</w:t>
+              <w:t xml:space="preserve">Office portal shows no data / scale house "Sync now" fails with 503</w:t>
             </w:r>
           </w:p>
         </w:tc>
@@ -7694,7 +8048,7 @@
                 <w:sz w:val="20"/>
                 <w:szCs w:val="20"/>
               </w:rPr>
-              <w:t xml:space="preserve">Working as intended! Use </w:t>
+              <w:t xml:space="preserve">The office is missing its </w:t>
             </w:r>
             <w:r>
               <w:rPr>
@@ -7706,7 +8060,7 @@
                 <w:sz w:val="18"/>
                 <w:szCs w:val="18"/>
               </w:rPr>
-              <w:t xml:space="preserve">vpsadmin</w:t>
+              <w:t xml:space="preserve">SYNC_KEY</w:t>
             </w:r>
             <w:r>
               <w:rPr>
@@ -7718,7 +8072,55 @@
                 <w:sz w:val="20"/>
                 <w:szCs w:val="20"/>
               </w:rPr>
-              <w:t xml:space="preserve">.</w:t>
+              <w:t xml:space="preserve"> (it refuses all syncs without one — fail-closed). Set </w:t>
+            </w:r>
+            <w:r>
+              <w:rPr>
+                <w:rFonts w:ascii="Courier New" w:cs="Courier New" w:eastAsia="Courier New" w:hAnsi="Courier New"/>
+                <w:b w:val="false"/>
+                <w:bCs w:val="false"/>
+                <w:i w:val="false"/>
+                <w:iCs w:val="false"/>
+                <w:sz w:val="18"/>
+                <w:szCs w:val="18"/>
+              </w:rPr>
+              <w:t xml:space="preserve">SYNC_KEY</w:t>
+            </w:r>
+            <w:r>
+              <w:rPr>
+                <w:rFonts w:ascii="Calibri" w:cs="Calibri" w:eastAsia="Calibri" w:hAnsi="Calibri"/>
+                <w:b w:val="false"/>
+                <w:bCs w:val="false"/>
+                <w:i w:val="false"/>
+                <w:iCs w:val="false"/>
+                <w:sz w:val="20"/>
+                <w:szCs w:val="20"/>
+              </w:rPr>
+              <w:t xml:space="preserve"> in the office's environment to the value from </w:t>
+            </w:r>
+            <w:r>
+              <w:rPr>
+                <w:rFonts w:ascii="Courier New" w:cs="Courier New" w:eastAsia="Courier New" w:hAnsi="Courier New"/>
+                <w:b w:val="false"/>
+                <w:bCs w:val="false"/>
+                <w:i w:val="false"/>
+                <w:iCs w:val="false"/>
+                <w:sz w:val="18"/>
+                <w:szCs w:val="18"/>
+              </w:rPr>
+              <w:t xml:space="preserve">sudo grep SYNC_KEY /opt/gtv9-deploy/.env</w:t>
+            </w:r>
+            <w:r>
+              <w:rPr>
+                <w:rFonts w:ascii="Calibri" w:cs="Calibri" w:eastAsia="Calibri" w:hAnsi="Calibri"/>
+                <w:b w:val="false"/>
+                <w:bCs w:val="false"/>
+                <w:i w:val="false"/>
+                <w:iCs w:val="false"/>
+                <w:sz w:val="20"/>
+                <w:szCs w:val="20"/>
+              </w:rPr>
+              <w:t xml:space="preserve">, and put the same value in the app's Settings → Main-office sync.</w:t>
             </w:r>
           </w:p>
         </w:tc>
@@ -7751,7 +8153,7 @@
                 <w:sz w:val="20"/>
                 <w:szCs w:val="20"/>
               </w:rPr>
-              <w:t xml:space="preserve">USB scale button says "Web Serial not available"</w:t>
+              <w:t xml:space="preserve">Can't log in as root anymore</w:t>
             </w:r>
           </w:p>
         </w:tc>
@@ -7778,103 +8180,31 @@
                 <w:sz w:val="20"/>
                 <w:szCs w:val="20"/>
               </w:rPr>
-              <w:t xml:space="preserve">Use </w:t>
+              <w:t xml:space="preserve">Working as intended! Use </w:t>
+            </w:r>
+            <w:r>
+              <w:rPr>
+                <w:rFonts w:ascii="Courier New" w:cs="Courier New" w:eastAsia="Courier New" w:hAnsi="Courier New"/>
+                <w:b w:val="false"/>
+                <w:bCs w:val="false"/>
+                <w:i w:val="false"/>
+                <w:iCs w:val="false"/>
+                <w:sz w:val="18"/>
+                <w:szCs w:val="18"/>
+              </w:rPr>
+              <w:t xml:space="preserve">vpsadmin</w:t>
             </w:r>
             <w:r>
               <w:rPr>
                 <w:rFonts w:ascii="Calibri" w:cs="Calibri" w:eastAsia="Calibri" w:hAnsi="Calibri"/>
-                <w:b/>
-                <w:bCs/>
+                <w:b w:val="false"/>
+                <w:bCs w:val="false"/>
                 <w:i w:val="false"/>
                 <w:iCs w:val="false"/>
                 <w:sz w:val="20"/>
                 <w:szCs w:val="20"/>
               </w:rPr>
-              <w:t xml:space="preserve">Chrome or Edge</w:t>
-            </w:r>
-            <w:r>
-              <w:rPr>
-                <w:rFonts w:ascii="Calibri" w:cs="Calibri" w:eastAsia="Calibri" w:hAnsi="Calibri"/>
-                <w:b w:val="false"/>
-                <w:bCs w:val="false"/>
-                <w:i w:val="false"/>
-                <w:iCs w:val="false"/>
-                <w:sz w:val="20"/>
-                <w:szCs w:val="20"/>
-              </w:rPr>
-              <w:t xml:space="preserve">, and the page must be </w:t>
-            </w:r>
-            <w:r>
-              <w:rPr>
-                <w:rFonts w:ascii="Calibri" w:cs="Calibri" w:eastAsia="Calibri" w:hAnsi="Calibri"/>
-                <w:b/>
-                <w:bCs/>
-                <w:i w:val="false"/>
-                <w:iCs w:val="false"/>
-                <w:sz w:val="20"/>
-                <w:szCs w:val="20"/>
-              </w:rPr>
-              <w:t xml:space="preserve">HTTPS</w:t>
-            </w:r>
-            <w:r>
-              <w:rPr>
-                <w:rFonts w:ascii="Calibri" w:cs="Calibri" w:eastAsia="Calibri" w:hAnsi="Calibri"/>
-                <w:b w:val="false"/>
-                <w:bCs w:val="false"/>
-                <w:i w:val="false"/>
-                <w:iCs w:val="false"/>
-                <w:sz w:val="20"/>
-                <w:szCs w:val="20"/>
-              </w:rPr>
-              <w:t xml:space="preserve"> (domain) or </w:t>
-            </w:r>
-            <w:r>
-              <w:rPr>
-                <w:rFonts w:ascii="Calibri" w:cs="Calibri" w:eastAsia="Calibri" w:hAnsi="Calibri"/>
-                <w:b/>
-                <w:bCs/>
-                <w:i w:val="false"/>
-                <w:iCs w:val="false"/>
-                <w:sz w:val="20"/>
-                <w:szCs w:val="20"/>
-              </w:rPr>
-              <w:t xml:space="preserve">localhost</w:t>
-            </w:r>
-            <w:r>
-              <w:rPr>
-                <w:rFonts w:ascii="Calibri" w:cs="Calibri" w:eastAsia="Calibri" w:hAnsi="Calibri"/>
-                <w:b w:val="false"/>
-                <w:bCs w:val="false"/>
-                <w:i w:val="false"/>
-                <w:iCs w:val="false"/>
-                <w:sz w:val="20"/>
-                <w:szCs w:val="20"/>
-              </w:rPr>
-              <w:t xml:space="preserve">. Plain </w:t>
-            </w:r>
-            <w:r>
-              <w:rPr>
-                <w:rFonts w:ascii="Courier New" w:cs="Courier New" w:eastAsia="Courier New" w:hAnsi="Courier New"/>
-                <w:b w:val="false"/>
-                <w:bCs w:val="false"/>
-                <w:i w:val="false"/>
-                <w:iCs w:val="false"/>
-                <w:sz w:val="18"/>
-                <w:szCs w:val="18"/>
-              </w:rPr>
-              <w:t xml:space="preserve">http://&lt;ip&gt;:3000</w:t>
-            </w:r>
-            <w:r>
-              <w:rPr>
-                <w:rFonts w:ascii="Calibri" w:cs="Calibri" w:eastAsia="Calibri" w:hAnsi="Calibri"/>
-                <w:b w:val="false"/>
-                <w:bCs w:val="false"/>
-                <w:i w:val="false"/>
-                <w:iCs w:val="false"/>
-                <w:sz w:val="20"/>
-                <w:szCs w:val="20"/>
-              </w:rPr>
-              <w:t xml:space="preserve"> from another PC won't work — set up the domain (Part 6).</w:t>
+              <w:t xml:space="preserve">.</w:t>
             </w:r>
           </w:p>
         </w:tc>
@@ -7907,31 +8237,7 @@
                 <w:sz w:val="20"/>
                 <w:szCs w:val="20"/>
               </w:rPr>
-              <w:t xml:space="preserve">Forgot </w:t>
-            </w:r>
-            <w:r>
-              <w:rPr>
-                <w:rFonts w:ascii="Courier New" w:cs="Courier New" w:eastAsia="Courier New" w:hAnsi="Courier New"/>
-                <w:b w:val="false"/>
-                <w:bCs w:val="false"/>
-                <w:i w:val="false"/>
-                <w:iCs w:val="false"/>
-                <w:sz w:val="18"/>
-                <w:szCs w:val="18"/>
-              </w:rPr>
-              <w:t xml:space="preserve">vpsadmin</w:t>
-            </w:r>
-            <w:r>
-              <w:rPr>
-                <w:rFonts w:ascii="Calibri" w:cs="Calibri" w:eastAsia="Calibri" w:hAnsi="Calibri"/>
-                <w:b w:val="false"/>
-                <w:bCs w:val="false"/>
-                <w:i w:val="false"/>
-                <w:iCs w:val="false"/>
-                <w:sz w:val="20"/>
-                <w:szCs w:val="20"/>
-              </w:rPr>
-              <w:t xml:space="preserve"> password</w:t>
+              <w:t xml:space="preserve">USB scale button says "Web Serial not available"</w:t>
             </w:r>
           </w:p>
         </w:tc>
@@ -7958,6 +8264,186 @@
                 <w:sz w:val="20"/>
                 <w:szCs w:val="20"/>
               </w:rPr>
+              <w:t xml:space="preserve">Use </w:t>
+            </w:r>
+            <w:r>
+              <w:rPr>
+                <w:rFonts w:ascii="Calibri" w:cs="Calibri" w:eastAsia="Calibri" w:hAnsi="Calibri"/>
+                <w:b/>
+                <w:bCs/>
+                <w:i w:val="false"/>
+                <w:iCs w:val="false"/>
+                <w:sz w:val="20"/>
+                <w:szCs w:val="20"/>
+              </w:rPr>
+              <w:t xml:space="preserve">Chrome or Edge</w:t>
+            </w:r>
+            <w:r>
+              <w:rPr>
+                <w:rFonts w:ascii="Calibri" w:cs="Calibri" w:eastAsia="Calibri" w:hAnsi="Calibri"/>
+                <w:b w:val="false"/>
+                <w:bCs w:val="false"/>
+                <w:i w:val="false"/>
+                <w:iCs w:val="false"/>
+                <w:sz w:val="20"/>
+                <w:szCs w:val="20"/>
+              </w:rPr>
+              <w:t xml:space="preserve">, and the page must be </w:t>
+            </w:r>
+            <w:r>
+              <w:rPr>
+                <w:rFonts w:ascii="Calibri" w:cs="Calibri" w:eastAsia="Calibri" w:hAnsi="Calibri"/>
+                <w:b/>
+                <w:bCs/>
+                <w:i w:val="false"/>
+                <w:iCs w:val="false"/>
+                <w:sz w:val="20"/>
+                <w:szCs w:val="20"/>
+              </w:rPr>
+              <w:t xml:space="preserve">HTTPS</w:t>
+            </w:r>
+            <w:r>
+              <w:rPr>
+                <w:rFonts w:ascii="Calibri" w:cs="Calibri" w:eastAsia="Calibri" w:hAnsi="Calibri"/>
+                <w:b w:val="false"/>
+                <w:bCs w:val="false"/>
+                <w:i w:val="false"/>
+                <w:iCs w:val="false"/>
+                <w:sz w:val="20"/>
+                <w:szCs w:val="20"/>
+              </w:rPr>
+              <w:t xml:space="preserve"> (domain) or </w:t>
+            </w:r>
+            <w:r>
+              <w:rPr>
+                <w:rFonts w:ascii="Calibri" w:cs="Calibri" w:eastAsia="Calibri" w:hAnsi="Calibri"/>
+                <w:b/>
+                <w:bCs/>
+                <w:i w:val="false"/>
+                <w:iCs w:val="false"/>
+                <w:sz w:val="20"/>
+                <w:szCs w:val="20"/>
+              </w:rPr>
+              <w:t xml:space="preserve">localhost</w:t>
+            </w:r>
+            <w:r>
+              <w:rPr>
+                <w:rFonts w:ascii="Calibri" w:cs="Calibri" w:eastAsia="Calibri" w:hAnsi="Calibri"/>
+                <w:b w:val="false"/>
+                <w:bCs w:val="false"/>
+                <w:i w:val="false"/>
+                <w:iCs w:val="false"/>
+                <w:sz w:val="20"/>
+                <w:szCs w:val="20"/>
+              </w:rPr>
+              <w:t xml:space="preserve">. Plain </w:t>
+            </w:r>
+            <w:r>
+              <w:rPr>
+                <w:rFonts w:ascii="Courier New" w:cs="Courier New" w:eastAsia="Courier New" w:hAnsi="Courier New"/>
+                <w:b w:val="false"/>
+                <w:bCs w:val="false"/>
+                <w:i w:val="false"/>
+                <w:iCs w:val="false"/>
+                <w:sz w:val="18"/>
+                <w:szCs w:val="18"/>
+              </w:rPr>
+              <w:t xml:space="preserve">http://&lt;ip&gt;:3000</w:t>
+            </w:r>
+            <w:r>
+              <w:rPr>
+                <w:rFonts w:ascii="Calibri" w:cs="Calibri" w:eastAsia="Calibri" w:hAnsi="Calibri"/>
+                <w:b w:val="false"/>
+                <w:bCs w:val="false"/>
+                <w:i w:val="false"/>
+                <w:iCs w:val="false"/>
+                <w:sz w:val="20"/>
+                <w:szCs w:val="20"/>
+              </w:rPr>
+              <w:t xml:space="preserve"> from another PC won't work — set up the domain (Part 6).</w:t>
+            </w:r>
+          </w:p>
+        </w:tc>
+      </w:tr>
+      <w:tr>
+        <w:trPr>
+          <w:cantSplit/>
+          <w:tblHeader w:val="false"/>
+        </w:trPr>
+        <w:tc>
+          <w:tcPr>
+            <w:tcMar>
+              <w:top w:type="dxa" w:w="60"/>
+              <w:left w:type="dxa" w:w="100"/>
+              <w:bottom w:type="dxa" w:w="60"/>
+              <w:right w:type="dxa" w:w="100"/>
+            </w:tcMar>
+          </w:tcPr>
+          <w:p>
+            <w:pPr>
+              <w:spacing w:line="276"/>
+            </w:pPr>
+            <w:r>
+              <w:rPr>
+                <w:rFonts w:ascii="Calibri" w:cs="Calibri" w:eastAsia="Calibri" w:hAnsi="Calibri"/>
+                <w:b w:val="false"/>
+                <w:bCs w:val="false"/>
+                <w:i w:val="false"/>
+                <w:iCs w:val="false"/>
+                <w:sz w:val="20"/>
+                <w:szCs w:val="20"/>
+              </w:rPr>
+              <w:t xml:space="preserve">Forgot </w:t>
+            </w:r>
+            <w:r>
+              <w:rPr>
+                <w:rFonts w:ascii="Courier New" w:cs="Courier New" w:eastAsia="Courier New" w:hAnsi="Courier New"/>
+                <w:b w:val="false"/>
+                <w:bCs w:val="false"/>
+                <w:i w:val="false"/>
+                <w:iCs w:val="false"/>
+                <w:sz w:val="18"/>
+                <w:szCs w:val="18"/>
+              </w:rPr>
+              <w:t xml:space="preserve">vpsadmin</w:t>
+            </w:r>
+            <w:r>
+              <w:rPr>
+                <w:rFonts w:ascii="Calibri" w:cs="Calibri" w:eastAsia="Calibri" w:hAnsi="Calibri"/>
+                <w:b w:val="false"/>
+                <w:bCs w:val="false"/>
+                <w:i w:val="false"/>
+                <w:iCs w:val="false"/>
+                <w:sz w:val="20"/>
+                <w:szCs w:val="20"/>
+              </w:rPr>
+              <w:t xml:space="preserve"> password</w:t>
+            </w:r>
+          </w:p>
+        </w:tc>
+        <w:tc>
+          <w:tcPr>
+            <w:tcMar>
+              <w:top w:type="dxa" w:w="60"/>
+              <w:left w:type="dxa" w:w="100"/>
+              <w:bottom w:type="dxa" w:w="60"/>
+              <w:right w:type="dxa" w:w="100"/>
+            </w:tcMar>
+          </w:tcPr>
+          <w:p>
+            <w:pPr>
+              <w:spacing w:line="276"/>
+            </w:pPr>
+            <w:r>
+              <w:rPr>
+                <w:rFonts w:ascii="Calibri" w:cs="Calibri" w:eastAsia="Calibri" w:hAnsi="Calibri"/>
+                <w:b w:val="false"/>
+                <w:bCs w:val="false"/>
+                <w:i w:val="false"/>
+                <w:iCs w:val="false"/>
+                <w:sz w:val="20"/>
+                <w:szCs w:val="20"/>
+              </w:rPr>
               <w:t xml:space="preserve">Log in via your VPS provider's web console as root, then </w:t>
             </w:r>
             <w:r>
@@ -7992,6 +8478,1307 @@
       <w:pPr>
         <w:spacing w:after="160"/>
       </w:pPr>
+    </w:p>
+    <w:p>
+      <w:pPr>
+        <w:spacing w:after="80"/>
+      </w:pPr>
+    </w:p>
+    <w:p>
+      <w:pPr>
+        <w:pBdr>
+          <w:bottom w:val="single" w:color="BBBBBB" w:sz="6" w:space="4"/>
+        </w:pBdr>
+        <w:spacing w:after="120" w:before="120"/>
+      </w:pPr>
+    </w:p>
+    <w:p>
+      <w:pPr>
+        <w:spacing w:after="80"/>
+      </w:pPr>
+    </w:p>
+    <w:p>
+      <w:pPr>
+        <w:pStyle w:val="Heading2"/>
+        <w:spacing w:after="140" w:before="280"/>
+      </w:pPr>
+      <w:r>
+        <w:rPr>
+          <w:rFonts w:ascii="Calibri" w:cs="Calibri" w:eastAsia="Calibri" w:hAnsi="Calibri"/>
+          <w:b/>
+          <w:bCs/>
+          <w:i w:val="false"/>
+          <w:iCs w:val="false"/>
+          <w:sz w:val="26"/>
+          <w:szCs w:val="26"/>
+        </w:rPr>
+        <w:t xml:space="preserve">PART 10 — Disaster recovery: rebuilding after a server wipe</w:t>
+      </w:r>
+    </w:p>
+    <w:p>
+      <w:pPr>
+        <w:spacing w:after="80"/>
+      </w:pPr>
+    </w:p>
+    <w:p>
+      <w:pPr>
+        <w:spacing w:after="100" w:line="300"/>
+      </w:pPr>
+      <w:r>
+        <w:rPr>
+          <w:rFonts w:ascii="Calibri" w:cs="Calibri" w:eastAsia="Calibri" w:hAnsi="Calibri"/>
+          <w:b w:val="false"/>
+          <w:bCs w:val="false"/>
+          <w:i w:val="false"/>
+          <w:iCs w:val="false"/>
+          <w:sz w:val="22"/>
+          <w:szCs w:val="22"/>
+        </w:rPr>
+        <w:t xml:space="preserve">The server is disposable — the script rebuilds it from GitHub in about</w:t>
+      </w:r>
+    </w:p>
+    <w:p>
+      <w:pPr>
+        <w:spacing w:after="100" w:line="300"/>
+      </w:pPr>
+      <w:r>
+        <w:rPr>
+          <w:rFonts w:ascii="Calibri" w:cs="Calibri" w:eastAsia="Calibri" w:hAnsi="Calibri"/>
+          <w:b w:val="false"/>
+          <w:bCs w:val="false"/>
+          <w:i w:val="false"/>
+          <w:iCs w:val="false"/>
+          <w:sz w:val="22"/>
+          <w:szCs w:val="22"/>
+        </w:rPr>
+        <w:t xml:space="preserve">30 minutes. </w:t>
+      </w:r>
+      <w:r>
+        <w:rPr>
+          <w:rFonts w:ascii="Calibri" w:cs="Calibri" w:eastAsia="Calibri" w:hAnsi="Calibri"/>
+          <w:b/>
+          <w:bCs/>
+          <w:i w:val="false"/>
+          <w:iCs w:val="false"/>
+          <w:sz w:val="22"/>
+          <w:szCs w:val="22"/>
+        </w:rPr>
+        <w:t xml:space="preserve">Your data is not disposable</w:t>
+      </w:r>
+      <w:r>
+        <w:rPr>
+          <w:rFonts w:ascii="Calibri" w:cs="Calibri" w:eastAsia="Calibri" w:hAnsi="Calibri"/>
+          <w:b w:val="false"/>
+          <w:bCs w:val="false"/>
+          <w:i w:val="false"/>
+          <w:iCs w:val="false"/>
+          <w:sz w:val="22"/>
+          <w:szCs w:val="22"/>
+        </w:rPr>
+        <w:t xml:space="preserve">: it lives in the MySQL data</w:t>
+      </w:r>
+    </w:p>
+    <w:p>
+      <w:pPr>
+        <w:spacing w:after="100" w:line="300"/>
+      </w:pPr>
+      <w:r>
+        <w:rPr>
+          <w:rFonts w:ascii="Calibri" w:cs="Calibri" w:eastAsia="Calibri" w:hAnsi="Calibri"/>
+          <w:b w:val="false"/>
+          <w:bCs w:val="false"/>
+          <w:i w:val="false"/>
+          <w:iCs w:val="false"/>
+          <w:sz w:val="22"/>
+          <w:szCs w:val="22"/>
+        </w:rPr>
+        <w:t xml:space="preserve">volume and in </w:t>
+      </w:r>
+      <w:r>
+        <w:rPr>
+          <w:rFonts w:ascii="Courier New" w:cs="Courier New" w:eastAsia="Courier New" w:hAnsi="Courier New"/>
+          <w:b w:val="false"/>
+          <w:bCs w:val="false"/>
+          <w:i w:val="false"/>
+          <w:iCs w:val="false"/>
+          <w:sz w:val="20"/>
+          <w:szCs w:val="20"/>
+        </w:rPr>
+        <w:t xml:space="preserve">/var/backups/grain-tracker/*.sql.gz</w:t>
+      </w:r>
+      <w:r>
+        <w:rPr>
+          <w:rFonts w:ascii="Calibri" w:cs="Calibri" w:eastAsia="Calibri" w:hAnsi="Calibri"/>
+          <w:b w:val="false"/>
+          <w:bCs w:val="false"/>
+          <w:i w:val="false"/>
+          <w:iCs w:val="false"/>
+          <w:sz w:val="22"/>
+          <w:szCs w:val="22"/>
+        </w:rPr>
+        <w:t xml:space="preserve">, both of which die</w:t>
+      </w:r>
+    </w:p>
+    <w:p>
+      <w:pPr>
+        <w:spacing w:after="100" w:line="300"/>
+      </w:pPr>
+      <w:r>
+        <w:rPr>
+          <w:rFonts w:ascii="Calibri" w:cs="Calibri" w:eastAsia="Calibri" w:hAnsi="Calibri"/>
+          <w:b w:val="false"/>
+          <w:bCs w:val="false"/>
+          <w:i w:val="false"/>
+          <w:iCs w:val="false"/>
+          <w:sz w:val="22"/>
+          <w:szCs w:val="22"/>
+        </w:rPr>
+        <w:t xml:space="preserve">with the server. The whole DR plan is one sentence: *keep a recent</w:t>
+      </w:r>
+    </w:p>
+    <w:p>
+      <w:pPr>
+        <w:spacing w:after="100" w:line="300"/>
+      </w:pPr>
+      <w:r>
+        <w:rPr>
+          <w:rFonts w:ascii="Calibri" w:cs="Calibri" w:eastAsia="Calibri" w:hAnsi="Calibri"/>
+          <w:b w:val="false"/>
+          <w:bCs w:val="false"/>
+          <w:i w:val="false"/>
+          <w:iCs w:val="false"/>
+          <w:sz w:val="22"/>
+          <w:szCs w:val="22"/>
+        </w:rPr>
+        <w:t xml:space="preserve">backup dump somewhere that is not the server.*</w:t>
+      </w:r>
+    </w:p>
+    <w:p>
+      <w:pPr>
+        <w:spacing w:after="80"/>
+      </w:pPr>
+    </w:p>
+    <w:p>
+      <w:pPr>
+        <w:pStyle w:val="Heading3"/>
+        <w:spacing w:after="140" w:before="280"/>
+      </w:pPr>
+      <w:r>
+        <w:rPr>
+          <w:rFonts w:ascii="Calibri" w:cs="Calibri" w:eastAsia="Calibri" w:hAnsi="Calibri"/>
+          <w:b/>
+          <w:bCs/>
+          <w:i w:val="false"/>
+          <w:iCs w:val="false"/>
+          <w:sz w:val="23"/>
+          <w:szCs w:val="23"/>
+        </w:rPr>
+        <w:t xml:space="preserve">Before the server dies (do this today)</w:t>
+      </w:r>
+    </w:p>
+    <w:p>
+      <w:pPr>
+        <w:spacing w:after="80"/>
+      </w:pPr>
+    </w:p>
+    <w:p>
+      <w:pPr>
+        <w:spacing w:after="60" w:line="288"/>
+      </w:pPr>
+      <w:r>
+        <w:rPr>
+          <w:rFonts w:ascii="Calibri" w:cs="Calibri" w:eastAsia="Calibri" w:hAnsi="Calibri"/>
+          <w:b/>
+          <w:bCs/>
+          <w:sz w:val="22"/>
+          <w:szCs w:val="22"/>
+        </w:rPr>
+        <w:t xml:space="preserve">1. </w:t>
+      </w:r>
+      <w:r>
+        <w:rPr>
+          <w:rFonts w:ascii="Calibri" w:cs="Calibri" w:eastAsia="Calibri" w:hAnsi="Calibri"/>
+          <w:b w:val="false"/>
+          <w:bCs w:val="false"/>
+          <w:i w:val="false"/>
+          <w:iCs w:val="false"/>
+          <w:sz w:val="22"/>
+          <w:szCs w:val="22"/>
+        </w:rPr>
+        <w:t xml:space="preserve">Take a fresh dump any time: </w:t>
+      </w:r>
+      <w:r>
+        <w:rPr>
+          <w:rFonts w:ascii="Courier New" w:cs="Courier New" w:eastAsia="Courier New" w:hAnsi="Courier New"/>
+          <w:b w:val="false"/>
+          <w:bCs w:val="false"/>
+          <w:i w:val="false"/>
+          <w:iCs w:val="false"/>
+          <w:sz w:val="20"/>
+          <w:szCs w:val="20"/>
+        </w:rPr>
+        <w:t xml:space="preserve">sudo grain-backup</w:t>
+      </w:r>
+    </w:p>
+    <w:p>
+      <w:pPr>
+        <w:spacing w:after="60" w:line="288"/>
+      </w:pPr>
+      <w:r>
+        <w:rPr>
+          <w:rFonts w:ascii="Calibri" w:cs="Calibri" w:eastAsia="Calibri" w:hAnsi="Calibri"/>
+          <w:b/>
+          <w:bCs/>
+          <w:sz w:val="22"/>
+          <w:szCs w:val="22"/>
+        </w:rPr>
+        <w:t xml:space="preserve">2. </w:t>
+      </w:r>
+      <w:r>
+        <w:rPr>
+          <w:rFonts w:ascii="Calibri" w:cs="Calibri" w:eastAsia="Calibri" w:hAnsi="Calibri"/>
+          <w:b w:val="false"/>
+          <w:bCs w:val="false"/>
+          <w:i w:val="false"/>
+          <w:iCs w:val="false"/>
+          <w:sz w:val="22"/>
+          <w:szCs w:val="22"/>
+        </w:rPr>
+        <w:t xml:space="preserve">Download it OFF the server (Bitvise → SFTP window →</w:t>
+      </w:r>
+    </w:p>
+    <w:p>
+      <w:pPr>
+        <w:spacing w:after="100" w:line="300"/>
+      </w:pPr>
+      <w:r>
+        <w:rPr>
+          <w:rFonts w:ascii="Calibri" w:cs="Calibri" w:eastAsia="Calibri" w:hAnsi="Calibri"/>
+          <w:b w:val="false"/>
+          <w:bCs w:val="false"/>
+          <w:i w:val="false"/>
+          <w:iCs w:val="false"/>
+          <w:sz w:val="22"/>
+          <w:szCs w:val="22"/>
+        </w:rPr>
+        <w:t xml:space="preserve">   </w:t>
+      </w:r>
+      <w:r>
+        <w:rPr>
+          <w:rFonts w:ascii="Courier New" w:cs="Courier New" w:eastAsia="Courier New" w:hAnsi="Courier New"/>
+          <w:b w:val="false"/>
+          <w:bCs w:val="false"/>
+          <w:i w:val="false"/>
+          <w:iCs w:val="false"/>
+          <w:sz w:val="20"/>
+          <w:szCs w:val="20"/>
+        </w:rPr>
+        <w:t xml:space="preserve">/var/backups/grain-tracker/</w:t>
+      </w:r>
+      <w:r>
+        <w:rPr>
+          <w:rFonts w:ascii="Calibri" w:cs="Calibri" w:eastAsia="Calibri" w:hAnsi="Calibri"/>
+          <w:b w:val="false"/>
+          <w:bCs w:val="false"/>
+          <w:i w:val="false"/>
+          <w:iCs w:val="false"/>
+          <w:sz w:val="22"/>
+          <w:szCs w:val="22"/>
+        </w:rPr>
+        <w:t xml:space="preserve">): grab the newest</w:t>
+      </w:r>
+    </w:p>
+    <w:p>
+      <w:pPr>
+        <w:spacing w:after="100" w:line="300"/>
+      </w:pPr>
+      <w:r>
+        <w:rPr>
+          <w:rFonts w:ascii="Calibri" w:cs="Calibri" w:eastAsia="Calibri" w:hAnsi="Calibri"/>
+          <w:b w:val="false"/>
+          <w:bCs w:val="false"/>
+          <w:i w:val="false"/>
+          <w:iCs w:val="false"/>
+          <w:sz w:val="22"/>
+          <w:szCs w:val="22"/>
+        </w:rPr>
+        <w:t xml:space="preserve">   </w:t>
+      </w:r>
+      <w:r>
+        <w:rPr>
+          <w:rFonts w:ascii="Courier New" w:cs="Courier New" w:eastAsia="Courier New" w:hAnsi="Courier New"/>
+          <w:b w:val="false"/>
+          <w:bCs w:val="false"/>
+          <w:i w:val="false"/>
+          <w:iCs w:val="false"/>
+          <w:sz w:val="20"/>
+          <w:szCs w:val="20"/>
+        </w:rPr>
+        <w:t xml:space="preserve">graintracker-&lt;date&gt;.sql.gz</w:t>
+      </w:r>
+      <w:r>
+        <w:rPr>
+          <w:rFonts w:ascii="Calibri" w:cs="Calibri" w:eastAsia="Calibri" w:hAnsi="Calibri"/>
+          <w:b w:val="false"/>
+          <w:bCs w:val="false"/>
+          <w:i w:val="false"/>
+          <w:iCs w:val="false"/>
+          <w:sz w:val="22"/>
+          <w:szCs w:val="22"/>
+        </w:rPr>
+        <w:t xml:space="preserve"> to your PC. Weekly is fine; do it</w:t>
+      </w:r>
+    </w:p>
+    <w:p>
+      <w:pPr>
+        <w:spacing w:after="100" w:line="300"/>
+      </w:pPr>
+      <w:r>
+        <w:rPr>
+          <w:rFonts w:ascii="Calibri" w:cs="Calibri" w:eastAsia="Calibri" w:hAnsi="Calibri"/>
+          <w:b w:val="false"/>
+          <w:bCs w:val="false"/>
+          <w:i w:val="false"/>
+          <w:iCs w:val="false"/>
+          <w:sz w:val="22"/>
+          <w:szCs w:val="22"/>
+        </w:rPr>
+        <w:t xml:space="preserve">   before any planned wipe or provider migration.</w:t>
+      </w:r>
+    </w:p>
+    <w:p>
+      <w:pPr>
+        <w:spacing w:after="60" w:line="288"/>
+      </w:pPr>
+      <w:r>
+        <w:rPr>
+          <w:rFonts w:ascii="Calibri" w:cs="Calibri" w:eastAsia="Calibri" w:hAnsi="Calibri"/>
+          <w:b/>
+          <w:bCs/>
+          <w:sz w:val="22"/>
+          <w:szCs w:val="22"/>
+        </w:rPr>
+        <w:t xml:space="preserve">3. </w:t>
+      </w:r>
+      <w:r>
+        <w:rPr>
+          <w:rFonts w:ascii="Calibri" w:cs="Calibri" w:eastAsia="Calibri" w:hAnsi="Calibri"/>
+          <w:b w:val="false"/>
+          <w:bCs w:val="false"/>
+          <w:i w:val="false"/>
+          <w:iCs w:val="false"/>
+          <w:sz w:val="22"/>
+          <w:szCs w:val="22"/>
+        </w:rPr>
+        <w:t xml:space="preserve">Optional but handy: save a copy of </w:t>
+      </w:r>
+      <w:r>
+        <w:rPr>
+          <w:rFonts w:ascii="Courier New" w:cs="Courier New" w:eastAsia="Courier New" w:hAnsi="Courier New"/>
+          <w:b w:val="false"/>
+          <w:bCs w:val="false"/>
+          <w:i w:val="false"/>
+          <w:iCs w:val="false"/>
+          <w:sz w:val="20"/>
+          <w:szCs w:val="20"/>
+        </w:rPr>
+        <w:t xml:space="preserve">/opt/gtv9-deploy/.env</w:t>
+      </w:r>
+    </w:p>
+    <w:p>
+      <w:pPr>
+        <w:spacing w:after="100" w:line="300"/>
+      </w:pPr>
+      <w:r>
+        <w:rPr>
+          <w:rFonts w:ascii="Calibri" w:cs="Calibri" w:eastAsia="Calibri" w:hAnsi="Calibri"/>
+          <w:b w:val="false"/>
+          <w:bCs w:val="false"/>
+          <w:i w:val="false"/>
+          <w:iCs w:val="false"/>
+          <w:sz w:val="22"/>
+          <w:szCs w:val="22"/>
+        </w:rPr>
+        <w:t xml:space="preserve">   (</w:t>
+      </w:r>
+      <w:r>
+        <w:rPr>
+          <w:rFonts w:ascii="Courier New" w:cs="Courier New" w:eastAsia="Courier New" w:hAnsi="Courier New"/>
+          <w:b w:val="false"/>
+          <w:bCs w:val="false"/>
+          <w:i w:val="false"/>
+          <w:iCs w:val="false"/>
+          <w:sz w:val="20"/>
+          <w:szCs w:val="20"/>
+        </w:rPr>
+        <w:t xml:space="preserve">sudo cat /opt/gtv9-deploy/.env &gt; gtv9-env-backup.txt</w:t>
+      </w:r>
+      <w:r>
+        <w:rPr>
+          <w:rFonts w:ascii="Calibri" w:cs="Calibri" w:eastAsia="Calibri" w:hAnsi="Calibri"/>
+          <w:b w:val="false"/>
+          <w:bCs w:val="false"/>
+          <w:i w:val="false"/>
+          <w:iCs w:val="false"/>
+          <w:sz w:val="22"/>
+          <w:szCs w:val="22"/>
+        </w:rPr>
+        <w:t xml:space="preserve">, then SFTP it</w:t>
+      </w:r>
+    </w:p>
+    <w:p>
+      <w:pPr>
+        <w:spacing w:after="100" w:line="300"/>
+      </w:pPr>
+      <w:r>
+        <w:rPr>
+          <w:rFonts w:ascii="Calibri" w:cs="Calibri" w:eastAsia="Calibri" w:hAnsi="Calibri"/>
+          <w:b w:val="false"/>
+          <w:bCs w:val="false"/>
+          <w:i w:val="false"/>
+          <w:iCs w:val="false"/>
+          <w:sz w:val="22"/>
+          <w:szCs w:val="22"/>
+        </w:rPr>
+        <w:t xml:space="preserve">   down) — it holds your app admin password and settings for reference.</w:t>
+      </w:r>
+    </w:p>
+    <w:p>
+      <w:pPr>
+        <w:spacing w:after="60" w:line="288"/>
+      </w:pPr>
+      <w:r>
+        <w:rPr>
+          <w:rFonts w:ascii="Calibri" w:cs="Calibri" w:eastAsia="Calibri" w:hAnsi="Calibri"/>
+          <w:b/>
+          <w:bCs/>
+          <w:sz w:val="22"/>
+          <w:szCs w:val="22"/>
+        </w:rPr>
+        <w:t xml:space="preserve">4. </w:t>
+      </w:r>
+      <w:r>
+        <w:rPr>
+          <w:rFonts w:ascii="Calibri" w:cs="Calibri" w:eastAsia="Calibri" w:hAnsi="Calibri"/>
+          <w:b w:val="false"/>
+          <w:bCs w:val="false"/>
+          <w:i w:val="false"/>
+          <w:iCs w:val="false"/>
+          <w:sz w:val="22"/>
+          <w:szCs w:val="22"/>
+        </w:rPr>
+        <w:t xml:space="preserve">If you use the main-office portal, it also holds a mirrored copy of</w:t>
+      </w:r>
+    </w:p>
+    <w:p>
+      <w:pPr>
+        <w:spacing w:after="100" w:line="300"/>
+      </w:pPr>
+      <w:r>
+        <w:rPr>
+          <w:rFonts w:ascii="Calibri" w:cs="Calibri" w:eastAsia="Calibri" w:hAnsi="Calibri"/>
+          <w:b w:val="false"/>
+          <w:bCs w:val="false"/>
+          <w:i w:val="false"/>
+          <w:iCs w:val="false"/>
+          <w:sz w:val="22"/>
+          <w:szCs w:val="22"/>
+        </w:rPr>
+        <w:t xml:space="preserve">   farmers/lots and every end-of-day report.</w:t>
+      </w:r>
+    </w:p>
+    <w:p>
+      <w:pPr>
+        <w:spacing w:after="80"/>
+      </w:pPr>
+    </w:p>
+    <w:p>
+      <w:pPr>
+        <w:pStyle w:val="Heading3"/>
+        <w:spacing w:after="140" w:before="280"/>
+      </w:pPr>
+      <w:r>
+        <w:rPr>
+          <w:rFonts w:ascii="Calibri" w:cs="Calibri" w:eastAsia="Calibri" w:hAnsi="Calibri"/>
+          <w:b/>
+          <w:bCs/>
+          <w:i w:val="false"/>
+          <w:iCs w:val="false"/>
+          <w:sz w:val="23"/>
+          <w:szCs w:val="23"/>
+        </w:rPr>
+        <w:t xml:space="preserve">After the wipe — full rebuild</w:t>
+      </w:r>
+    </w:p>
+    <w:p>
+      <w:pPr>
+        <w:spacing w:after="80"/>
+      </w:pPr>
+    </w:p>
+    <w:p>
+      <w:pPr>
+        <w:spacing w:after="60" w:line="288"/>
+      </w:pPr>
+      <w:r>
+        <w:rPr>
+          <w:rFonts w:ascii="Calibri" w:cs="Calibri" w:eastAsia="Calibri" w:hAnsi="Calibri"/>
+          <w:b/>
+          <w:bCs/>
+          <w:sz w:val="22"/>
+          <w:szCs w:val="22"/>
+        </w:rPr>
+        <w:t xml:space="preserve">1. </w:t>
+      </w:r>
+      <w:r>
+        <w:rPr>
+          <w:rFonts w:ascii="Calibri" w:cs="Calibri" w:eastAsia="Calibri" w:hAnsi="Calibri"/>
+          <w:b w:val="false"/>
+          <w:bCs w:val="false"/>
+          <w:i w:val="false"/>
+          <w:iCs w:val="false"/>
+          <w:sz w:val="22"/>
+          <w:szCs w:val="22"/>
+        </w:rPr>
+        <w:t xml:space="preserve">Create a fresh </w:t>
+      </w:r>
+      <w:r>
+        <w:rPr>
+          <w:rFonts w:ascii="Calibri" w:cs="Calibri" w:eastAsia="Calibri" w:hAnsi="Calibri"/>
+          <w:b/>
+          <w:bCs/>
+          <w:i w:val="false"/>
+          <w:iCs w:val="false"/>
+          <w:sz w:val="22"/>
+          <w:szCs w:val="22"/>
+        </w:rPr>
+        <w:t xml:space="preserve">Ubuntu 24.04</w:t>
+      </w:r>
+      <w:r>
+        <w:rPr>
+          <w:rFonts w:ascii="Calibri" w:cs="Calibri" w:eastAsia="Calibri" w:hAnsi="Calibri"/>
+          <w:b w:val="false"/>
+          <w:bCs w:val="false"/>
+          <w:i w:val="false"/>
+          <w:iCs w:val="false"/>
+          <w:sz w:val="22"/>
+          <w:szCs w:val="22"/>
+        </w:rPr>
+        <w:t xml:space="preserve"> VPS, note the new IP. If you use a</w:t>
+      </w:r>
+    </w:p>
+    <w:p>
+      <w:pPr>
+        <w:spacing w:after="100" w:line="300"/>
+      </w:pPr>
+      <w:r>
+        <w:rPr>
+          <w:rFonts w:ascii="Calibri" w:cs="Calibri" w:eastAsia="Calibri" w:hAnsi="Calibri"/>
+          <w:b w:val="false"/>
+          <w:bCs w:val="false"/>
+          <w:i w:val="false"/>
+          <w:iCs w:val="false"/>
+          <w:sz w:val="22"/>
+          <w:szCs w:val="22"/>
+        </w:rPr>
+        <w:t xml:space="preserve">   domain, point its DNS A record at the new IP now (HTTPS renews</w:t>
+      </w:r>
+    </w:p>
+    <w:p>
+      <w:pPr>
+        <w:spacing w:after="100" w:line="300"/>
+      </w:pPr>
+      <w:r>
+        <w:rPr>
+          <w:rFonts w:ascii="Calibri" w:cs="Calibri" w:eastAsia="Calibri" w:hAnsi="Calibri"/>
+          <w:b w:val="false"/>
+          <w:bCs w:val="false"/>
+          <w:i w:val="false"/>
+          <w:iCs w:val="false"/>
+          <w:sz w:val="22"/>
+          <w:szCs w:val="22"/>
+        </w:rPr>
+        <w:t xml:space="preserve">   automatically once the new server is up).</w:t>
+      </w:r>
+    </w:p>
+    <w:p>
+      <w:pPr>
+        <w:spacing w:after="60" w:line="288"/>
+      </w:pPr>
+      <w:r>
+        <w:rPr>
+          <w:rFonts w:ascii="Calibri" w:cs="Calibri" w:eastAsia="Calibri" w:hAnsi="Calibri"/>
+          <w:b/>
+          <w:bCs/>
+          <w:sz w:val="22"/>
+          <w:szCs w:val="22"/>
+        </w:rPr>
+        <w:t xml:space="preserve">2. </w:t>
+      </w:r>
+      <w:r>
+        <w:rPr>
+          <w:rFonts w:ascii="Calibri" w:cs="Calibri" w:eastAsia="Calibri" w:hAnsi="Calibri"/>
+          <w:b w:val="false"/>
+          <w:bCs w:val="false"/>
+          <w:i w:val="false"/>
+          <w:iCs w:val="false"/>
+          <w:sz w:val="22"/>
+          <w:szCs w:val="22"/>
+        </w:rPr>
+        <w:t xml:space="preserve">Log in as root (Bitvise/PuTTY), then fetch and run the CURRENT</w:t>
+      </w:r>
+    </w:p>
+    <w:p>
+      <w:pPr>
+        <w:spacing w:after="100" w:line="300"/>
+      </w:pPr>
+      <w:r>
+        <w:rPr>
+          <w:rFonts w:ascii="Calibri" w:cs="Calibri" w:eastAsia="Calibri" w:hAnsi="Calibri"/>
+          <w:b w:val="false"/>
+          <w:bCs w:val="false"/>
+          <w:i w:val="false"/>
+          <w:iCs w:val="false"/>
+          <w:sz w:val="22"/>
+          <w:szCs w:val="22"/>
+        </w:rPr>
+        <w:t xml:space="preserve">   installer from GitHub — do not reuse an old copy on your PC:</w:t>
+      </w:r>
+    </w:p>
+    <w:p>
+      <w:pPr>
+        <w:spacing w:after="100" w:line="300"/>
+      </w:pPr>
+      <w:r>
+        <w:rPr>
+          <w:rFonts w:ascii="Calibri" w:cs="Calibri" w:eastAsia="Calibri" w:hAnsi="Calibri"/>
+          <w:b w:val="false"/>
+          <w:bCs w:val="false"/>
+          <w:i w:val="false"/>
+          <w:iCs w:val="false"/>
+          <w:sz w:val="22"/>
+          <w:szCs w:val="22"/>
+        </w:rPr>
+        <w:t xml:space="preserve">   ```bash</w:t>
+      </w:r>
+    </w:p>
+    <w:p>
+      <w:pPr>
+        <w:spacing w:after="100" w:line="300"/>
+      </w:pPr>
+      <w:r>
+        <w:rPr>
+          <w:rFonts w:ascii="Calibri" w:cs="Calibri" w:eastAsia="Calibri" w:hAnsi="Calibri"/>
+          <w:b w:val="false"/>
+          <w:bCs w:val="false"/>
+          <w:i w:val="false"/>
+          <w:iCs w:val="false"/>
+          <w:sz w:val="22"/>
+          <w:szCs w:val="22"/>
+        </w:rPr>
+        <w:t xml:space="preserve">   curl -fsSL https://raw.githubusercontent.com/kurtimas/GTv9/main/gtv8-vps-setup.sh -o gtv8-vps-setup.sh</w:t>
+      </w:r>
+    </w:p>
+    <w:p>
+      <w:pPr>
+        <w:spacing w:after="100" w:line="300"/>
+      </w:pPr>
+      <w:r>
+        <w:rPr>
+          <w:rFonts w:ascii="Calibri" w:cs="Calibri" w:eastAsia="Calibri" w:hAnsi="Calibri"/>
+          <w:b w:val="false"/>
+          <w:bCs w:val="false"/>
+          <w:i w:val="false"/>
+          <w:iCs w:val="false"/>
+          <w:sz w:val="22"/>
+          <w:szCs w:val="22"/>
+        </w:rPr>
+        <w:t xml:space="preserve">   chmod +x gtv8-vps-setup.sh</w:t>
+      </w:r>
+    </w:p>
+    <w:p>
+      <w:pPr>
+        <w:spacing w:after="100" w:line="300"/>
+      </w:pPr>
+      <w:r>
+        <w:rPr>
+          <w:rFonts w:ascii="Calibri" w:cs="Calibri" w:eastAsia="Calibri" w:hAnsi="Calibri"/>
+          <w:b w:val="false"/>
+          <w:bCs w:val="false"/>
+          <w:i w:val="false"/>
+          <w:iCs w:val="false"/>
+          <w:sz w:val="22"/>
+          <w:szCs w:val="22"/>
+        </w:rPr>
+        <w:t xml:space="preserve">   ADMIN_PASSWORD='YourServerLoginPassword' ./gtv8-vps-setup.sh</w:t>
+      </w:r>
+    </w:p>
+    <w:p>
+      <w:pPr>
+        <w:spacing w:after="100" w:line="300"/>
+      </w:pPr>
+      <w:r>
+        <w:rPr>
+          <w:rFonts w:ascii="Calibri" w:cs="Calibri" w:eastAsia="Calibri" w:hAnsi="Calibri"/>
+          <w:b w:val="false"/>
+          <w:bCs w:val="false"/>
+          <w:i w:val="false"/>
+          <w:iCs w:val="false"/>
+          <w:sz w:val="22"/>
+          <w:szCs w:val="22"/>
+        </w:rPr>
+        <w:t xml:space="preserve">   ```</w:t>
+      </w:r>
+    </w:p>
+    <w:p>
+      <w:pPr>
+        <w:spacing w:after="100" w:line="300"/>
+      </w:pPr>
+      <w:r>
+        <w:rPr>
+          <w:rFonts w:ascii="Calibri" w:cs="Calibri" w:eastAsia="Calibri" w:hAnsi="Calibri"/>
+          <w:b w:val="false"/>
+          <w:bCs w:val="false"/>
+          <w:i w:val="false"/>
+          <w:iCs w:val="false"/>
+          <w:sz w:val="22"/>
+          <w:szCs w:val="22"/>
+        </w:rPr>
+        <w:t xml:space="preserve">   Check the CONFIG block first (nano) — </w:t>
+      </w:r>
+      <w:r>
+        <w:rPr>
+          <w:rFonts w:ascii="Courier New" w:cs="Courier New" w:eastAsia="Courier New" w:hAnsi="Courier New"/>
+          <w:b w:val="false"/>
+          <w:bCs w:val="false"/>
+          <w:i w:val="false"/>
+          <w:iCs w:val="false"/>
+          <w:sz w:val="20"/>
+          <w:szCs w:val="20"/>
+        </w:rPr>
+        <w:t xml:space="preserve">DOMAIN</w:t>
+      </w:r>
+      <w:r>
+        <w:rPr>
+          <w:rFonts w:ascii="Calibri" w:cs="Calibri" w:eastAsia="Calibri" w:hAnsi="Calibri"/>
+          <w:b w:val="false"/>
+          <w:bCs w:val="false"/>
+          <w:i w:val="false"/>
+          <w:iCs w:val="false"/>
+          <w:sz w:val="22"/>
+          <w:szCs w:val="22"/>
+        </w:rPr>
+        <w:t xml:space="preserve"> and </w:t>
+      </w:r>
+      <w:r>
+        <w:rPr>
+          <w:rFonts w:ascii="Courier New" w:cs="Courier New" w:eastAsia="Courier New" w:hAnsi="Courier New"/>
+          <w:b w:val="false"/>
+          <w:bCs w:val="false"/>
+          <w:i w:val="false"/>
+          <w:iCs w:val="false"/>
+          <w:sz w:val="20"/>
+          <w:szCs w:val="20"/>
+        </w:rPr>
+        <w:t xml:space="preserve">TIMEZONE</w:t>
+      </w:r>
+      <w:r>
+        <w:rPr>
+          <w:rFonts w:ascii="Calibri" w:cs="Calibri" w:eastAsia="Calibri" w:hAnsi="Calibri"/>
+          <w:b w:val="false"/>
+          <w:bCs w:val="false"/>
+          <w:i w:val="false"/>
+          <w:iCs w:val="false"/>
+          <w:sz w:val="22"/>
+          <w:szCs w:val="22"/>
+        </w:rPr>
+        <w:t xml:space="preserve"> matter.</w:t>
+      </w:r>
+    </w:p>
+    <w:p>
+      <w:pPr>
+        <w:spacing w:after="100" w:line="300"/>
+      </w:pPr>
+      <w:r>
+        <w:rPr>
+          <w:rFonts w:ascii="Calibri" w:cs="Calibri" w:eastAsia="Calibri" w:hAnsi="Calibri"/>
+          <w:b w:val="false"/>
+          <w:bCs w:val="false"/>
+          <w:i w:val="false"/>
+          <w:iCs w:val="false"/>
+          <w:sz w:val="22"/>
+          <w:szCs w:val="22"/>
+        </w:rPr>
+        <w:t xml:space="preserve">   This rebuilds everything: firewall, desktop, Docker, the app, HTTPS,</w:t>
+      </w:r>
+    </w:p>
+    <w:p>
+      <w:pPr>
+        <w:spacing w:after="100" w:line="300"/>
+      </w:pPr>
+      <w:r>
+        <w:rPr>
+          <w:rFonts w:ascii="Calibri" w:cs="Calibri" w:eastAsia="Calibri" w:hAnsi="Calibri"/>
+          <w:b w:val="false"/>
+          <w:bCs w:val="false"/>
+          <w:i w:val="false"/>
+          <w:iCs w:val="false"/>
+          <w:sz w:val="22"/>
+          <w:szCs w:val="22"/>
+        </w:rPr>
+        <w:t xml:space="preserve">   backups, auto-start. Note the printed </w:t>
+      </w:r>
+      <w:r>
+        <w:rPr>
+          <w:rFonts w:ascii="Calibri" w:cs="Calibri" w:eastAsia="Calibri" w:hAnsi="Calibri"/>
+          <w:b/>
+          <w:bCs/>
+          <w:i w:val="false"/>
+          <w:iCs w:val="false"/>
+          <w:sz w:val="22"/>
+          <w:szCs w:val="22"/>
+        </w:rPr>
+        <w:t xml:space="preserve">app admin password</w:t>
+      </w:r>
+      <w:r>
+        <w:rPr>
+          <w:rFonts w:ascii="Calibri" w:cs="Calibri" w:eastAsia="Calibri" w:hAnsi="Calibri"/>
+          <w:b w:val="false"/>
+          <w:bCs w:val="false"/>
+          <w:i w:val="false"/>
+          <w:iCs w:val="false"/>
+          <w:sz w:val="22"/>
+          <w:szCs w:val="22"/>
+        </w:rPr>
+        <w:t xml:space="preserve">.</w:t>
+      </w:r>
+    </w:p>
+    <w:p>
+      <w:pPr>
+        <w:spacing w:after="60" w:line="288"/>
+      </w:pPr>
+      <w:r>
+        <w:rPr>
+          <w:rFonts w:ascii="Calibri" w:cs="Calibri" w:eastAsia="Calibri" w:hAnsi="Calibri"/>
+          <w:b/>
+          <w:bCs/>
+          <w:sz w:val="22"/>
+          <w:szCs w:val="22"/>
+        </w:rPr>
+        <w:t xml:space="preserve">3. </w:t>
+      </w:r>
+      <w:r>
+        <w:rPr>
+          <w:rFonts w:ascii="Calibri" w:cs="Calibri" w:eastAsia="Calibri" w:hAnsi="Calibri"/>
+          <w:b w:val="false"/>
+          <w:bCs w:val="false"/>
+          <w:i w:val="false"/>
+          <w:iCs w:val="false"/>
+          <w:sz w:val="22"/>
+          <w:szCs w:val="22"/>
+        </w:rPr>
+        <w:t xml:space="preserve">Upload your saved dump back to the server (Bitvise SFTP → drop</w:t>
+      </w:r>
+    </w:p>
+    <w:p>
+      <w:pPr>
+        <w:spacing w:after="100" w:line="300"/>
+      </w:pPr>
+      <w:r>
+        <w:rPr>
+          <w:rFonts w:ascii="Calibri" w:cs="Calibri" w:eastAsia="Calibri" w:hAnsi="Calibri"/>
+          <w:b w:val="false"/>
+          <w:bCs w:val="false"/>
+          <w:i w:val="false"/>
+          <w:iCs w:val="false"/>
+          <w:sz w:val="22"/>
+          <w:szCs w:val="22"/>
+        </w:rPr>
+        <w:t xml:space="preserve">   </w:t>
+      </w:r>
+      <w:r>
+        <w:rPr>
+          <w:rFonts w:ascii="Courier New" w:cs="Courier New" w:eastAsia="Courier New" w:hAnsi="Courier New"/>
+          <w:b w:val="false"/>
+          <w:bCs w:val="false"/>
+          <w:i w:val="false"/>
+          <w:iCs w:val="false"/>
+          <w:sz w:val="20"/>
+          <w:szCs w:val="20"/>
+        </w:rPr>
+        <w:t xml:space="preserve">graintracker-&lt;date&gt;.sql.gz</w:t>
+      </w:r>
+      <w:r>
+        <w:rPr>
+          <w:rFonts w:ascii="Calibri" w:cs="Calibri" w:eastAsia="Calibri" w:hAnsi="Calibri"/>
+          <w:b w:val="false"/>
+          <w:bCs w:val="false"/>
+          <w:i w:val="false"/>
+          <w:iCs w:val="false"/>
+          <w:sz w:val="22"/>
+          <w:szCs w:val="22"/>
+        </w:rPr>
+        <w:t xml:space="preserve"> into </w:t>
+      </w:r>
+      <w:r>
+        <w:rPr>
+          <w:rFonts w:ascii="Courier New" w:cs="Courier New" w:eastAsia="Courier New" w:hAnsi="Courier New"/>
+          <w:b w:val="false"/>
+          <w:bCs w:val="false"/>
+          <w:i w:val="false"/>
+          <w:iCs w:val="false"/>
+          <w:sz w:val="20"/>
+          <w:szCs w:val="20"/>
+        </w:rPr>
+        <w:t xml:space="preserve">/home/vpsadmin/</w:t>
+      </w:r>
+      <w:r>
+        <w:rPr>
+          <w:rFonts w:ascii="Calibri" w:cs="Calibri" w:eastAsia="Calibri" w:hAnsi="Calibri"/>
+          <w:b w:val="false"/>
+          <w:bCs w:val="false"/>
+          <w:i w:val="false"/>
+          <w:iCs w:val="false"/>
+          <w:sz w:val="22"/>
+          <w:szCs w:val="22"/>
+        </w:rPr>
+        <w:t xml:space="preserve">).</w:t>
+      </w:r>
+    </w:p>
+    <w:p>
+      <w:pPr>
+        <w:spacing w:after="60" w:line="288"/>
+      </w:pPr>
+      <w:r>
+        <w:rPr>
+          <w:rFonts w:ascii="Calibri" w:cs="Calibri" w:eastAsia="Calibri" w:hAnsi="Calibri"/>
+          <w:b/>
+          <w:bCs/>
+          <w:sz w:val="22"/>
+          <w:szCs w:val="22"/>
+        </w:rPr>
+        <w:t xml:space="preserve">4. </w:t>
+      </w:r>
+      <w:r>
+        <w:rPr>
+          <w:rFonts w:ascii="Calibri" w:cs="Calibri" w:eastAsia="Calibri" w:hAnsi="Calibri"/>
+          <w:b w:val="false"/>
+          <w:bCs w:val="false"/>
+          <w:i w:val="false"/>
+          <w:iCs w:val="false"/>
+          <w:sz w:val="22"/>
+          <w:szCs w:val="22"/>
+        </w:rPr>
+        <w:t xml:space="preserve">Restore the data into the fresh database:</w:t>
+      </w:r>
+    </w:p>
+    <w:p>
+      <w:pPr>
+        <w:spacing w:after="100" w:line="300"/>
+      </w:pPr>
+      <w:r>
+        <w:rPr>
+          <w:rFonts w:ascii="Calibri" w:cs="Calibri" w:eastAsia="Calibri" w:hAnsi="Calibri"/>
+          <w:b w:val="false"/>
+          <w:bCs w:val="false"/>
+          <w:i w:val="false"/>
+          <w:iCs w:val="false"/>
+          <w:sz w:val="22"/>
+          <w:szCs w:val="22"/>
+        </w:rPr>
+        <w:t xml:space="preserve">   ```bash</w:t>
+      </w:r>
+    </w:p>
+    <w:p>
+      <w:pPr>
+        <w:spacing w:after="100" w:line="300"/>
+      </w:pPr>
+      <w:r>
+        <w:rPr>
+          <w:rFonts w:ascii="Calibri" w:cs="Calibri" w:eastAsia="Calibri" w:hAnsi="Calibri"/>
+          <w:b w:val="false"/>
+          <w:bCs w:val="false"/>
+          <w:i w:val="false"/>
+          <w:iCs w:val="false"/>
+          <w:sz w:val="22"/>
+          <w:szCs w:val="22"/>
+        </w:rPr>
+        <w:t xml:space="preserve">   gunzip &lt; /home/vpsadmin/graintracker-&lt;date&gt;.sql.gz | \</w:t>
+      </w:r>
+    </w:p>
+    <w:p>
+      <w:pPr>
+        <w:spacing w:after="100" w:line="300"/>
+      </w:pPr>
+      <w:r>
+        <w:rPr>
+          <w:rFonts w:ascii="Calibri" w:cs="Calibri" w:eastAsia="Calibri" w:hAnsi="Calibri"/>
+          <w:b w:val="false"/>
+          <w:bCs w:val="false"/>
+          <w:i w:val="false"/>
+          <w:iCs w:val="false"/>
+          <w:sz w:val="22"/>
+          <w:szCs w:val="22"/>
+        </w:rPr>
+        <w:t xml:space="preserve">     docker exec -i grain-mysql sh -c 'exec mysql -uroot -p"$MYSQL_ROOT_PASSWORD" graintracker'</w:t>
+      </w:r>
+    </w:p>
+    <w:p>
+      <w:pPr>
+        <w:spacing w:after="100" w:line="300"/>
+      </w:pPr>
+      <w:r>
+        <w:rPr>
+          <w:rFonts w:ascii="Calibri" w:cs="Calibri" w:eastAsia="Calibri" w:hAnsi="Calibri"/>
+          <w:b w:val="false"/>
+          <w:bCs w:val="false"/>
+          <w:i w:val="false"/>
+          <w:iCs w:val="false"/>
+          <w:sz w:val="22"/>
+          <w:szCs w:val="22"/>
+        </w:rPr>
+        <w:t xml:space="preserve">   ```</w:t>
+      </w:r>
+    </w:p>
+    <w:p>
+      <w:pPr>
+        <w:spacing w:after="100" w:line="300"/>
+      </w:pPr>
+      <w:r>
+        <w:rPr>
+          <w:rFonts w:ascii="Calibri" w:cs="Calibri" w:eastAsia="Calibri" w:hAnsi="Calibri"/>
+          <w:b w:val="false"/>
+          <w:bCs w:val="false"/>
+          <w:i w:val="false"/>
+          <w:iCs w:val="false"/>
+          <w:sz w:val="22"/>
+          <w:szCs w:val="22"/>
+        </w:rPr>
+        <w:t xml:space="preserve">   That brings back every farmer, lot, weight sheet, load, and bin level.</w:t>
+      </w:r>
+    </w:p>
+    <w:p>
+      <w:pPr>
+        <w:spacing w:after="60" w:line="288"/>
+      </w:pPr>
+      <w:r>
+        <w:rPr>
+          <w:rFonts w:ascii="Calibri" w:cs="Calibri" w:eastAsia="Calibri" w:hAnsi="Calibri"/>
+          <w:b/>
+          <w:bCs/>
+          <w:sz w:val="22"/>
+          <w:szCs w:val="22"/>
+        </w:rPr>
+        <w:t xml:space="preserve">5. </w:t>
+      </w:r>
+      <w:r>
+        <w:rPr>
+          <w:rFonts w:ascii="Calibri" w:cs="Calibri" w:eastAsia="Calibri" w:hAnsi="Calibri"/>
+          <w:b w:val="false"/>
+          <w:bCs w:val="false"/>
+          <w:i w:val="false"/>
+          <w:iCs w:val="false"/>
+          <w:sz w:val="22"/>
+          <w:szCs w:val="22"/>
+        </w:rPr>
+        <w:t xml:space="preserve">If you had a custom app admin password, re-set it and restart the app:</w:t>
+      </w:r>
+    </w:p>
+    <w:p>
+      <w:pPr>
+        <w:spacing w:after="100" w:line="300"/>
+      </w:pPr>
+      <w:r>
+        <w:rPr>
+          <w:rFonts w:ascii="Calibri" w:cs="Calibri" w:eastAsia="Calibri" w:hAnsi="Calibri"/>
+          <w:b w:val="false"/>
+          <w:bCs w:val="false"/>
+          <w:i w:val="false"/>
+          <w:iCs w:val="false"/>
+          <w:sz w:val="22"/>
+          <w:szCs w:val="22"/>
+        </w:rPr>
+        <w:t xml:space="preserve">   ```bash</w:t>
+      </w:r>
+    </w:p>
+    <w:p>
+      <w:pPr>
+        <w:spacing w:after="100" w:line="300"/>
+      </w:pPr>
+      <w:r>
+        <w:rPr>
+          <w:rFonts w:ascii="Calibri" w:cs="Calibri" w:eastAsia="Calibri" w:hAnsi="Calibri"/>
+          <w:b w:val="false"/>
+          <w:bCs w:val="false"/>
+          <w:i w:val="false"/>
+          <w:iCs w:val="false"/>
+          <w:sz w:val="22"/>
+          <w:szCs w:val="22"/>
+        </w:rPr>
+        <w:t xml:space="preserve">   sudo sed -i 's|^ADMIN_PASSWORD=.*|ADMIN_PASSWORD=YourAppPassword|' /opt/gtv9-deploy/.env</w:t>
+      </w:r>
+    </w:p>
+    <w:p>
+      <w:pPr>
+        <w:spacing w:after="100" w:line="300"/>
+      </w:pPr>
+      <w:r>
+        <w:rPr>
+          <w:rFonts w:ascii="Calibri" w:cs="Calibri" w:eastAsia="Calibri" w:hAnsi="Calibri"/>
+          <w:b w:val="false"/>
+          <w:bCs w:val="false"/>
+          <w:i w:val="false"/>
+          <w:iCs w:val="false"/>
+          <w:sz w:val="22"/>
+          <w:szCs w:val="22"/>
+        </w:rPr>
+        <w:t xml:space="preserve">   cd /opt/gtv9-deploy &amp;&amp; docker compose up -d --force-recreate app</w:t>
+      </w:r>
+    </w:p>
+    <w:p>
+      <w:pPr>
+        <w:spacing w:after="100" w:line="300"/>
+      </w:pPr>
+      <w:r>
+        <w:rPr>
+          <w:rFonts w:ascii="Calibri" w:cs="Calibri" w:eastAsia="Calibri" w:hAnsi="Calibri"/>
+          <w:b w:val="false"/>
+          <w:bCs w:val="false"/>
+          <w:i w:val="false"/>
+          <w:iCs w:val="false"/>
+          <w:sz w:val="22"/>
+          <w:szCs w:val="22"/>
+        </w:rPr>
+        <w:t xml:space="preserve">   ```</w:t>
+      </w:r>
+    </w:p>
+    <w:p>
+      <w:pPr>
+        <w:spacing w:after="60" w:line="288"/>
+      </w:pPr>
+      <w:r>
+        <w:rPr>
+          <w:rFonts w:ascii="Calibri" w:cs="Calibri" w:eastAsia="Calibri" w:hAnsi="Calibri"/>
+          <w:b/>
+          <w:bCs/>
+          <w:sz w:val="22"/>
+          <w:szCs w:val="22"/>
+        </w:rPr>
+        <w:t xml:space="preserve">6. </w:t>
+      </w:r>
+      <w:r>
+        <w:rPr>
+          <w:rFonts w:ascii="Calibri" w:cs="Calibri" w:eastAsia="Calibri" w:hAnsi="Calibri"/>
+          <w:b w:val="false"/>
+          <w:bCs w:val="false"/>
+          <w:i w:val="false"/>
+          <w:iCs w:val="false"/>
+          <w:sz w:val="22"/>
+          <w:szCs w:val="22"/>
+        </w:rPr>
+        <w:t xml:space="preserve">Verify in the browser: dashboard, a farmer, a sheet, bin levels.</w:t>
+      </w:r>
+    </w:p>
+    <w:p>
+      <w:pPr>
+        <w:spacing w:after="100" w:line="300"/>
+      </w:pPr>
+      <w:r>
+        <w:rPr>
+          <w:rFonts w:ascii="Calibri" w:cs="Calibri" w:eastAsia="Calibri" w:hAnsi="Calibri"/>
+          <w:b w:val="false"/>
+          <w:bCs w:val="false"/>
+          <w:i w:val="false"/>
+          <w:iCs w:val="false"/>
+          <w:sz w:val="22"/>
+          <w:szCs w:val="22"/>
+        </w:rPr>
+        <w:t xml:space="preserve">   Office-sync settings live in the database, so they come back with the</w:t>
+      </w:r>
+    </w:p>
+    <w:p>
+      <w:pPr>
+        <w:spacing w:after="100" w:line="300"/>
+      </w:pPr>
+      <w:r>
+        <w:rPr>
+          <w:rFonts w:ascii="Calibri" w:cs="Calibri" w:eastAsia="Calibri" w:hAnsi="Calibri"/>
+          <w:b w:val="false"/>
+          <w:bCs w:val="false"/>
+          <w:i w:val="false"/>
+          <w:iCs w:val="false"/>
+          <w:sz w:val="22"/>
+          <w:szCs w:val="22"/>
+        </w:rPr>
+        <w:t xml:space="preserve">   restore automatically.</w:t>
+      </w:r>
+    </w:p>
+    <w:p>
+      <w:pPr>
+        <w:spacing w:after="80"/>
+      </w:pPr>
+    </w:p>
+    <w:p>
+      <w:pPr>
+        <w:spacing w:after="100" w:line="300"/>
+      </w:pPr>
+      <w:r>
+        <w:rPr>
+          <w:rFonts w:ascii="Calibri" w:cs="Calibri" w:eastAsia="Calibri" w:hAnsi="Calibri"/>
+          <w:b/>
+          <w:bCs/>
+          <w:i w:val="false"/>
+          <w:iCs w:val="false"/>
+          <w:sz w:val="22"/>
+          <w:szCs w:val="22"/>
+        </w:rPr>
+        <w:t xml:space="preserve">If the server dies with no off-server backup</w:t>
+      </w:r>
+      <w:r>
+        <w:rPr>
+          <w:rFonts w:ascii="Calibri" w:cs="Calibri" w:eastAsia="Calibri" w:hAnsi="Calibri"/>
+          <w:b w:val="false"/>
+          <w:bCs w:val="false"/>
+          <w:i w:val="false"/>
+          <w:iCs w:val="false"/>
+          <w:sz w:val="22"/>
+          <w:szCs w:val="22"/>
+        </w:rPr>
+        <w:t xml:space="preserve">, the data is gone except</w:t>
+      </w:r>
+    </w:p>
+    <w:p>
+      <w:pPr>
+        <w:spacing w:after="100" w:line="300"/>
+      </w:pPr>
+      <w:r>
+        <w:rPr>
+          <w:rFonts w:ascii="Calibri" w:cs="Calibri" w:eastAsia="Calibri" w:hAnsi="Calibri"/>
+          <w:b w:val="false"/>
+          <w:bCs w:val="false"/>
+          <w:i w:val="false"/>
+          <w:iCs w:val="false"/>
+          <w:sz w:val="22"/>
+          <w:szCs w:val="22"/>
+        </w:rPr>
+        <w:t xml:space="preserve">for whatever the office portal mirrored — which is why step 2 above is</w:t>
+      </w:r>
+    </w:p>
+    <w:p>
+      <w:pPr>
+        <w:spacing w:after="100" w:line="300"/>
+      </w:pPr>
+      <w:r>
+        <w:rPr>
+          <w:rFonts w:ascii="Calibri" w:cs="Calibri" w:eastAsia="Calibri" w:hAnsi="Calibri"/>
+          <w:b w:val="false"/>
+          <w:bCs w:val="false"/>
+          <w:i w:val="false"/>
+          <w:iCs w:val="false"/>
+          <w:sz w:val="22"/>
+          <w:szCs w:val="22"/>
+        </w:rPr>
+        <w:t xml:space="preserve">the one habit that matters.</w:t>
+      </w:r>
     </w:p>
     <w:p>
       <w:pPr>
@@ -8208,7 +9995,55 @@
           <w:sz w:val="22"/>
           <w:szCs w:val="22"/>
         </w:rPr>
-        <w:t xml:space="preserve"> — the app (Node 20, non-root, health-checked; built from </w:t>
+        <w:t xml:space="preserve"> — the app (Node 20, non-root, health-checked; built from the repo root via </w:t>
+      </w:r>
+      <w:r>
+        <w:rPr>
+          <w:rFonts w:ascii="Courier New" w:cs="Courier New" w:eastAsia="Courier New" w:hAnsi="Courier New"/>
+          <w:b w:val="false"/>
+          <w:bCs w:val="false"/>
+          <w:i w:val="false"/>
+          <w:iCs w:val="false"/>
+          <w:sz w:val="20"/>
+          <w:szCs w:val="20"/>
+        </w:rPr>
+        <w:t xml:space="preserve">app/Dockerfile</w:t>
+      </w:r>
+      <w:r>
+        <w:rPr>
+          <w:rFonts w:ascii="Calibri" w:cs="Calibri" w:eastAsia="Calibri" w:hAnsi="Calibri"/>
+          <w:b w:val="false"/>
+          <w:bCs w:val="false"/>
+          <w:i w:val="false"/>
+          <w:iCs w:val="false"/>
+          <w:sz w:val="22"/>
+          <w:szCs w:val="22"/>
+        </w:rPr>
+        <w:t xml:space="preserve"> — the build context must be </w:t>
+      </w:r>
+      <w:r>
+        <w:rPr>
+          <w:rFonts w:ascii="Courier New" w:cs="Courier New" w:eastAsia="Courier New" w:hAnsi="Courier New"/>
+          <w:b w:val="false"/>
+          <w:bCs w:val="false"/>
+          <w:i w:val="false"/>
+          <w:iCs w:val="false"/>
+          <w:sz w:val="20"/>
+          <w:szCs w:val="20"/>
+        </w:rPr>
+        <w:t xml:space="preserve">/opt/GTv9</w:t>
+      </w:r>
+      <w:r>
+        <w:rPr>
+          <w:rFonts w:ascii="Calibri" w:cs="Calibri" w:eastAsia="Calibri" w:hAnsi="Calibri"/>
+          <w:b w:val="false"/>
+          <w:bCs w:val="false"/>
+          <w:i w:val="false"/>
+          <w:iCs w:val="false"/>
+          <w:sz w:val="22"/>
+          <w:szCs w:val="22"/>
+        </w:rPr>
+        <w:t xml:space="preserve">, not </w:t>
       </w:r>
       <w:r>
         <w:rPr>

</xml_diff>

<commit_message>
Install guide: fetch the installer fresh from GitHub (Part 2)
Hand-pasting the script into nano is how a stale copy ended up on the
server and failed mid-install after the monorepo restructure. Part 2 now
downloads gtv8-vps-setup.sh from raw.githubusercontent.com every time.
Docx regenerated to match.
</commit_message>
<xml_diff>
--- a/Grain-Tracker-Install-Guide.docx
+++ b/Grain-Tracker-Install-Guide.docx
@@ -1732,7 +1732,7 @@
           <w:sz w:val="26"/>
           <w:szCs w:val="26"/>
         </w:rPr>
-        <w:t xml:space="preserve">PART 2 — Put the setup script on the server</w:t>
+        <w:t xml:space="preserve">PART 2 — Download the setup script onto the server</w:t>
       </w:r>
     </w:p>
     <w:p>
@@ -1759,136 +1759,110 @@
     </w:p>
     <w:p>
       <w:pPr>
+        <w:spacing w:after="100" w:line="300"/>
+      </w:pPr>
+      <w:r>
+        <w:rPr>
+          <w:rFonts w:ascii="Calibri" w:cs="Calibri" w:eastAsia="Calibri" w:hAnsi="Calibri"/>
+          <w:b/>
+          <w:bCs/>
+          <w:i w:val="false"/>
+          <w:iCs w:val="false"/>
+          <w:sz w:val="22"/>
+          <w:szCs w:val="22"/>
+        </w:rPr>
+        <w:t xml:space="preserve">Always download it fresh from GitHub</w:t>
+      </w:r>
+      <w:r>
+        <w:rPr>
+          <w:rFonts w:ascii="Calibri" w:cs="Calibri" w:eastAsia="Calibri" w:hAnsi="Calibri"/>
+          <w:b w:val="false"/>
+          <w:bCs w:val="false"/>
+          <w:i w:val="false"/>
+          <w:iCs w:val="false"/>
+          <w:sz w:val="22"/>
+          <w:szCs w:val="22"/>
+        </w:rPr>
+        <w:t xml:space="preserve"> — an old copy (saved on your PC</w:t>
+      </w:r>
+    </w:p>
+    <w:p>
+      <w:pPr>
+        <w:spacing w:after="100" w:line="300"/>
+      </w:pPr>
+      <w:r>
+        <w:rPr>
+          <w:rFonts w:ascii="Calibri" w:cs="Calibri" w:eastAsia="Calibri" w:hAnsi="Calibri"/>
+          <w:b w:val="false"/>
+          <w:bCs w:val="false"/>
+          <w:i w:val="false"/>
+          <w:iCs w:val="false"/>
+          <w:sz w:val="22"/>
+          <w:szCs w:val="22"/>
+        </w:rPr>
+        <w:t xml:space="preserve">or left on a previous server) will not match the current app and can</w:t>
+      </w:r>
+    </w:p>
+    <w:p>
+      <w:pPr>
+        <w:spacing w:after="100" w:line="300"/>
+      </w:pPr>
+      <w:r>
+        <w:rPr>
+          <w:rFonts w:ascii="Calibri" w:cs="Calibri" w:eastAsia="Calibri" w:hAnsi="Calibri"/>
+          <w:b w:val="false"/>
+          <w:bCs w:val="false"/>
+          <w:i w:val="false"/>
+          <w:iCs w:val="false"/>
+          <w:sz w:val="22"/>
+          <w:szCs w:val="22"/>
+        </w:rPr>
+        <w:t xml:space="preserve">fail mid-install:</w:t>
+      </w:r>
+    </w:p>
+    <w:p>
+      <w:pPr>
         <w:spacing w:after="80"/>
       </w:pPr>
     </w:p>
     <w:p>
       <w:pPr>
-        <w:spacing w:after="60" w:line="288"/>
-      </w:pPr>
-      <w:r>
-        <w:rPr>
-          <w:rFonts w:ascii="Calibri" w:cs="Calibri" w:eastAsia="Calibri" w:hAnsi="Calibri"/>
-          <w:b/>
-          <w:bCs/>
-          <w:sz w:val="22"/>
-          <w:szCs w:val="22"/>
-        </w:rPr>
-        <w:t xml:space="preserve">1. </w:t>
-      </w:r>
-      <w:r>
-        <w:rPr>
-          <w:rFonts w:ascii="Calibri" w:cs="Calibri" w:eastAsia="Calibri" w:hAnsi="Calibri"/>
-          <w:b w:val="false"/>
-          <w:bCs w:val="false"/>
-          <w:i w:val="false"/>
-          <w:iCs w:val="false"/>
-          <w:sz w:val="22"/>
-          <w:szCs w:val="22"/>
-        </w:rPr>
-        <w:t xml:space="preserve">Create the file:</w:t>
-      </w:r>
-    </w:p>
-    <w:p>
-      <w:pPr>
-        <w:spacing w:after="100" w:line="300"/>
-      </w:pPr>
-      <w:r>
-        <w:rPr>
-          <w:rFonts w:ascii="Calibri" w:cs="Calibri" w:eastAsia="Calibri" w:hAnsi="Calibri"/>
-          <w:b w:val="false"/>
-          <w:bCs w:val="false"/>
-          <w:i w:val="false"/>
-          <w:iCs w:val="false"/>
-          <w:sz w:val="22"/>
-          <w:szCs w:val="22"/>
-        </w:rPr>
-        <w:t xml:space="preserve">   ```bash</w:t>
-      </w:r>
-    </w:p>
-    <w:p>
-      <w:pPr>
-        <w:spacing w:after="100" w:line="300"/>
-      </w:pPr>
-      <w:r>
-        <w:rPr>
-          <w:rFonts w:ascii="Calibri" w:cs="Calibri" w:eastAsia="Calibri" w:hAnsi="Calibri"/>
-          <w:b w:val="false"/>
-          <w:bCs w:val="false"/>
-          <w:i w:val="false"/>
-          <w:iCs w:val="false"/>
-          <w:sz w:val="22"/>
-          <w:szCs w:val="22"/>
-        </w:rPr>
-        <w:t xml:space="preserve">   nano gtv8-vps-setup.sh</w:t>
-      </w:r>
-    </w:p>
-    <w:p>
-      <w:pPr>
-        <w:spacing w:after="100" w:line="300"/>
-      </w:pPr>
-      <w:r>
-        <w:rPr>
-          <w:rFonts w:ascii="Calibri" w:cs="Calibri" w:eastAsia="Calibri" w:hAnsi="Calibri"/>
-          <w:b w:val="false"/>
-          <w:bCs w:val="false"/>
-          <w:i w:val="false"/>
-          <w:iCs w:val="false"/>
-          <w:sz w:val="22"/>
-          <w:szCs w:val="22"/>
-        </w:rPr>
-        <w:t xml:space="preserve">   ```</w:t>
-      </w:r>
-    </w:p>
-    <w:p>
-      <w:pPr>
-        <w:spacing w:after="60" w:line="288"/>
-      </w:pPr>
-      <w:r>
-        <w:rPr>
-          <w:rFonts w:ascii="Calibri" w:cs="Calibri" w:eastAsia="Calibri" w:hAnsi="Calibri"/>
-          <w:b/>
-          <w:bCs/>
-          <w:sz w:val="22"/>
-          <w:szCs w:val="22"/>
-        </w:rPr>
-        <w:t xml:space="preserve">2. </w:t>
-      </w:r>
-      <w:r>
-        <w:rPr>
-          <w:rFonts w:ascii="Calibri" w:cs="Calibri" w:eastAsia="Calibri" w:hAnsi="Calibri"/>
-          <w:b w:val="false"/>
-          <w:bCs w:val="false"/>
-          <w:i w:val="false"/>
-          <w:iCs w:val="false"/>
-          <w:sz w:val="22"/>
-          <w:szCs w:val="22"/>
-        </w:rPr>
-        <w:t xml:space="preserve">A text editor opens. </w:t>
-      </w:r>
-      <w:r>
-        <w:rPr>
-          <w:rFonts w:ascii="Calibri" w:cs="Calibri" w:eastAsia="Calibri" w:hAnsi="Calibri"/>
-          <w:b/>
-          <w:bCs/>
-          <w:i w:val="false"/>
-          <w:iCs w:val="false"/>
-          <w:sz w:val="22"/>
-          <w:szCs w:val="22"/>
-        </w:rPr>
-        <w:t xml:space="preserve">Paste the entire contents</w:t>
-      </w:r>
-      <w:r>
-        <w:rPr>
-          <w:rFonts w:ascii="Calibri" w:cs="Calibri" w:eastAsia="Calibri" w:hAnsi="Calibri"/>
-          <w:b w:val="false"/>
-          <w:bCs w:val="false"/>
-          <w:i w:val="false"/>
-          <w:iCs w:val="false"/>
-          <w:sz w:val="22"/>
-          <w:szCs w:val="22"/>
-        </w:rPr>
-        <w:t xml:space="preserve"> of </w:t>
+        <w:spacing w:after="0" w:before="0" w:line="240"/>
+      </w:pPr>
+      <w:r>
+        <w:rPr>
+          <w:rFonts w:ascii="Courier New" w:cs="Courier New" w:eastAsia="Courier New" w:hAnsi="Courier New"/>
+          <w:sz w:val="18"/>
+          <w:szCs w:val="18"/>
+        </w:rPr>
+        <w:t xml:space="preserve">curl -fsSL https://raw.githubusercontent.com/kurtimas/GTv9/main/gtv8-vps-setup.sh -o gtv8-vps-setup.sh</w:t>
+      </w:r>
+    </w:p>
+    <w:p>
+      <w:pPr>
+        <w:spacing w:after="120"/>
+      </w:pPr>
+    </w:p>
+    <w:p>
+      <w:pPr>
+        <w:spacing w:after="80"/>
+      </w:pPr>
+    </w:p>
+    <w:p>
+      <w:pPr>
+        <w:spacing w:after="100" w:line="300"/>
+      </w:pPr>
+      <w:r>
+        <w:rPr>
+          <w:rFonts w:ascii="Calibri" w:cs="Calibri" w:eastAsia="Calibri" w:hAnsi="Calibri"/>
+          <w:b w:val="false"/>
+          <w:bCs w:val="false"/>
+          <w:i w:val="false"/>
+          <w:iCs w:val="false"/>
+          <w:sz w:val="22"/>
+          <w:szCs w:val="22"/>
+        </w:rPr>
+        <w:t xml:space="preserve">If </w:t>
       </w:r>
       <w:r>
         <w:rPr>
@@ -1900,147 +1874,48 @@
           <w:sz w:val="20"/>
           <w:szCs w:val="20"/>
         </w:rPr>
-        <w:t xml:space="preserve">gtv8-vps-setup.sh</w:t>
-      </w:r>
-    </w:p>
-    <w:p>
-      <w:pPr>
-        <w:spacing w:after="100" w:line="300"/>
-      </w:pPr>
-      <w:r>
-        <w:rPr>
-          <w:rFonts w:ascii="Calibri" w:cs="Calibri" w:eastAsia="Calibri" w:hAnsi="Calibri"/>
-          <w:b w:val="false"/>
-          <w:bCs w:val="false"/>
-          <w:i w:val="false"/>
-          <w:iCs w:val="false"/>
-          <w:sz w:val="22"/>
-          <w:szCs w:val="22"/>
-        </w:rPr>
-        <w:t xml:space="preserve">   (from the repo) into the window — in Bitvise's terminal, </w:t>
-      </w:r>
-      <w:r>
-        <w:rPr>
-          <w:rFonts w:ascii="Calibri" w:cs="Calibri" w:eastAsia="Calibri" w:hAnsi="Calibri"/>
-          <w:b/>
-          <w:bCs/>
-          <w:i w:val="false"/>
-          <w:iCs w:val="false"/>
-          <w:sz w:val="22"/>
-          <w:szCs w:val="22"/>
-        </w:rPr>
-        <w:t xml:space="preserve">right-click</w:t>
-      </w:r>
-      <w:r>
-        <w:rPr>
-          <w:rFonts w:ascii="Calibri" w:cs="Calibri" w:eastAsia="Calibri" w:hAnsi="Calibri"/>
-          <w:b w:val="false"/>
-          <w:bCs w:val="false"/>
-          <w:i w:val="false"/>
-          <w:iCs w:val="false"/>
-          <w:sz w:val="22"/>
-          <w:szCs w:val="22"/>
-        </w:rPr>
-        <w:t xml:space="preserve"> to paste.</w:t>
-      </w:r>
-    </w:p>
-    <w:p>
-      <w:pPr>
-        <w:spacing w:after="60" w:line="288"/>
-      </w:pPr>
-      <w:r>
-        <w:rPr>
-          <w:rFonts w:ascii="Calibri" w:cs="Calibri" w:eastAsia="Calibri" w:hAnsi="Calibri"/>
-          <w:b/>
-          <w:bCs/>
-          <w:sz w:val="22"/>
-          <w:szCs w:val="22"/>
-        </w:rPr>
-        <w:t xml:space="preserve">3. </w:t>
-      </w:r>
-      <w:r>
-        <w:rPr>
-          <w:rFonts w:ascii="Calibri" w:cs="Calibri" w:eastAsia="Calibri" w:hAnsi="Calibri"/>
-          <w:b w:val="false"/>
-          <w:bCs w:val="false"/>
-          <w:i w:val="false"/>
-          <w:iCs w:val="false"/>
-          <w:sz w:val="22"/>
-          <w:szCs w:val="22"/>
-        </w:rPr>
-        <w:t xml:space="preserve">Save and exit: press </w:t>
-      </w:r>
-      <w:r>
-        <w:rPr>
-          <w:rFonts w:ascii="Calibri" w:cs="Calibri" w:eastAsia="Calibri" w:hAnsi="Calibri"/>
-          <w:b/>
-          <w:bCs/>
-          <w:i w:val="false"/>
-          <w:iCs w:val="false"/>
-          <w:sz w:val="22"/>
-          <w:szCs w:val="22"/>
-        </w:rPr>
-        <w:t xml:space="preserve">Ctrl+O</w:t>
-      </w:r>
-      <w:r>
-        <w:rPr>
-          <w:rFonts w:ascii="Calibri" w:cs="Calibri" w:eastAsia="Calibri" w:hAnsi="Calibri"/>
-          <w:b w:val="false"/>
-          <w:bCs w:val="false"/>
-          <w:i w:val="false"/>
-          <w:iCs w:val="false"/>
-          <w:sz w:val="22"/>
-          <w:szCs w:val="22"/>
-        </w:rPr>
-        <w:t xml:space="preserve">, then </w:t>
-      </w:r>
-      <w:r>
-        <w:rPr>
-          <w:rFonts w:ascii="Calibri" w:cs="Calibri" w:eastAsia="Calibri" w:hAnsi="Calibri"/>
-          <w:b/>
-          <w:bCs/>
-          <w:i w:val="false"/>
-          <w:iCs w:val="false"/>
-          <w:sz w:val="22"/>
-          <w:szCs w:val="22"/>
-        </w:rPr>
-        <w:t xml:space="preserve">Enter</w:t>
-      </w:r>
-      <w:r>
-        <w:rPr>
-          <w:rFonts w:ascii="Calibri" w:cs="Calibri" w:eastAsia="Calibri" w:hAnsi="Calibri"/>
-          <w:b w:val="false"/>
-          <w:bCs w:val="false"/>
-          <w:i w:val="false"/>
-          <w:iCs w:val="false"/>
-          <w:sz w:val="22"/>
-          <w:szCs w:val="22"/>
-        </w:rPr>
-        <w:t xml:space="preserve">, then </w:t>
-      </w:r>
-      <w:r>
-        <w:rPr>
-          <w:rFonts w:ascii="Calibri" w:cs="Calibri" w:eastAsia="Calibri" w:hAnsi="Calibri"/>
-          <w:b/>
-          <w:bCs/>
-          <w:i w:val="false"/>
-          <w:iCs w:val="false"/>
-          <w:sz w:val="22"/>
-          <w:szCs w:val="22"/>
-        </w:rPr>
-        <w:t xml:space="preserve">Ctrl+X</w:t>
-      </w:r>
-      <w:r>
-        <w:rPr>
-          <w:rFonts w:ascii="Calibri" w:cs="Calibri" w:eastAsia="Calibri" w:hAnsi="Calibri"/>
-          <w:b w:val="false"/>
-          <w:bCs w:val="false"/>
-          <w:i w:val="false"/>
-          <w:iCs w:val="false"/>
-          <w:sz w:val="22"/>
-          <w:szCs w:val="22"/>
-        </w:rPr>
-        <w:t xml:space="preserve">.</w:t>
+        <w:t xml:space="preserve">curl</w:t>
+      </w:r>
+      <w:r>
+        <w:rPr>
+          <w:rFonts w:ascii="Calibri" w:cs="Calibri" w:eastAsia="Calibri" w:hAnsi="Calibri"/>
+          <w:b w:val="false"/>
+          <w:bCs w:val="false"/>
+          <w:i w:val="false"/>
+          <w:iCs w:val="false"/>
+          <w:sz w:val="22"/>
+          <w:szCs w:val="22"/>
+        </w:rPr>
+        <w:t xml:space="preserve"> is missing on the fresh box, run </w:t>
+      </w:r>
+      <w:r>
+        <w:rPr>
+          <w:rFonts w:ascii="Courier New" w:cs="Courier New" w:eastAsia="Courier New" w:hAnsi="Courier New"/>
+          <w:b w:val="false"/>
+          <w:bCs w:val="false"/>
+          <w:i w:val="false"/>
+          <w:iCs w:val="false"/>
+          <w:sz w:val="20"/>
+          <w:szCs w:val="20"/>
+        </w:rPr>
+        <w:t xml:space="preserve">apt update &amp;&amp; apt install -y curl</w:t>
+      </w:r>
+    </w:p>
+    <w:p>
+      <w:pPr>
+        <w:spacing w:after="100" w:line="300"/>
+      </w:pPr>
+      <w:r>
+        <w:rPr>
+          <w:rFonts w:ascii="Calibri" w:cs="Calibri" w:eastAsia="Calibri" w:hAnsi="Calibri"/>
+          <w:b w:val="false"/>
+          <w:bCs w:val="false"/>
+          <w:i w:val="false"/>
+          <w:iCs w:val="false"/>
+          <w:sz w:val="22"/>
+          <w:szCs w:val="22"/>
+        </w:rPr>
+        <w:t xml:space="preserve">first, then retry. Next, edit the CONFIG block (Part 3).</w:t>
       </w:r>
     </w:p>
     <w:p>
@@ -6880,7 +6755,7 @@
                 <w:sz w:val="20"/>
                 <w:szCs w:val="20"/>
               </w:rPr>
-              <w:t xml:space="preserve">Check auto-start service</w:t>
+              <w:t xml:space="preserve">One-time: allow SFTP access to backups</w:t>
             </w:r>
           </w:p>
         </w:tc>
@@ -6907,7 +6782,7 @@
                 <w:sz w:val="18"/>
                 <w:szCs w:val="18"/>
               </w:rPr>
-              <w:t xml:space="preserve">sudo systemctl status grain-tracker</w:t>
+              <w:t xml:space="preserve">sudo chgrp sudo /var/backups/grain-tracker &amp;&amp; sudo chmod 750 /var/backups/grain-tracker</w:t>
             </w:r>
           </w:p>
         </w:tc>
@@ -6940,7 +6815,7 @@
                 <w:sz w:val="20"/>
                 <w:szCs w:val="20"/>
               </w:rPr>
-              <w:t xml:space="preserve">Reboot the whole server</w:t>
+              <w:t xml:space="preserve">Check auto-start service</w:t>
             </w:r>
           </w:p>
         </w:tc>
@@ -6967,6 +6842,66 @@
                 <w:sz w:val="18"/>
                 <w:szCs w:val="18"/>
               </w:rPr>
+              <w:t xml:space="preserve">sudo systemctl status grain-tracker</w:t>
+            </w:r>
+          </w:p>
+        </w:tc>
+      </w:tr>
+      <w:tr>
+        <w:trPr>
+          <w:cantSplit/>
+          <w:tblHeader w:val="false"/>
+        </w:trPr>
+        <w:tc>
+          <w:tcPr>
+            <w:tcMar>
+              <w:top w:type="dxa" w:w="60"/>
+              <w:left w:type="dxa" w:w="100"/>
+              <w:bottom w:type="dxa" w:w="60"/>
+              <w:right w:type="dxa" w:w="100"/>
+            </w:tcMar>
+          </w:tcPr>
+          <w:p>
+            <w:pPr>
+              <w:spacing w:line="276"/>
+            </w:pPr>
+            <w:r>
+              <w:rPr>
+                <w:rFonts w:ascii="Calibri" w:cs="Calibri" w:eastAsia="Calibri" w:hAnsi="Calibri"/>
+                <w:b w:val="false"/>
+                <w:bCs w:val="false"/>
+                <w:i w:val="false"/>
+                <w:iCs w:val="false"/>
+                <w:sz w:val="20"/>
+                <w:szCs w:val="20"/>
+              </w:rPr>
+              <w:t xml:space="preserve">Reboot the whole server</w:t>
+            </w:r>
+          </w:p>
+        </w:tc>
+        <w:tc>
+          <w:tcPr>
+            <w:tcMar>
+              <w:top w:type="dxa" w:w="60"/>
+              <w:left w:type="dxa" w:w="100"/>
+              <w:bottom w:type="dxa" w:w="60"/>
+              <w:right w:type="dxa" w:w="100"/>
+            </w:tcMar>
+          </w:tcPr>
+          <w:p>
+            <w:pPr>
+              <w:spacing w:line="276"/>
+            </w:pPr>
+            <w:r>
+              <w:rPr>
+                <w:rFonts w:ascii="Courier New" w:cs="Courier New" w:eastAsia="Courier New" w:hAnsi="Courier New"/>
+                <w:b w:val="false"/>
+                <w:bCs w:val="false"/>
+                <w:i w:val="false"/>
+                <w:iCs w:val="false"/>
+                <w:sz w:val="18"/>
+                <w:szCs w:val="18"/>
+              </w:rPr>
               <w:t xml:space="preserve">sudo reboot</w:t>
             </w:r>
             <w:r>
@@ -7140,6 +7075,64 @@
           <w:szCs w:val="22"/>
         </w:rPr>
         <w:t xml:space="preserve">to your PC. If the server ever dies, that file plus this guide rebuilds everything.</w:t>
+      </w:r>
+    </w:p>
+    <w:p>
+      <w:pPr>
+        <w:spacing w:after="100" w:line="300"/>
+      </w:pPr>
+      <w:r>
+        <w:rPr>
+          <w:rFonts w:ascii="Calibri" w:cs="Calibri" w:eastAsia="Calibri" w:hAnsi="Calibri"/>
+          <w:b w:val="false"/>
+          <w:bCs w:val="false"/>
+          <w:i w:val="false"/>
+          <w:iCs w:val="false"/>
+          <w:sz w:val="22"/>
+          <w:szCs w:val="22"/>
+        </w:rPr>
+        <w:t xml:space="preserve">(Servers installed before June 2026 keep that folder root-only — run the</w:t>
+      </w:r>
+    </w:p>
+    <w:p>
+      <w:pPr>
+        <w:spacing w:after="100" w:line="300"/>
+      </w:pPr>
+      <w:r>
+        <w:rPr>
+          <w:rFonts w:ascii="Calibri" w:cs="Calibri" w:eastAsia="Calibri" w:hAnsi="Calibri"/>
+          <w:b w:val="false"/>
+          <w:bCs w:val="false"/>
+          <w:i w:val="false"/>
+          <w:iCs w:val="false"/>
+          <w:sz w:val="22"/>
+          <w:szCs w:val="22"/>
+        </w:rPr>
+        <w:t xml:space="preserve">"one-time" command in the table above and SFTP works as </w:t>
+      </w:r>
+      <w:r>
+        <w:rPr>
+          <w:rFonts w:ascii="Courier New" w:cs="Courier New" w:eastAsia="Courier New" w:hAnsi="Courier New"/>
+          <w:b w:val="false"/>
+          <w:bCs w:val="false"/>
+          <w:i w:val="false"/>
+          <w:iCs w:val="false"/>
+          <w:sz w:val="20"/>
+          <w:szCs w:val="20"/>
+        </w:rPr>
+        <w:t xml:space="preserve">vpsadmin</w:t>
+      </w:r>
+      <w:r>
+        <w:rPr>
+          <w:rFonts w:ascii="Calibri" w:cs="Calibri" w:eastAsia="Calibri" w:hAnsi="Calibri"/>
+          <w:b w:val="false"/>
+          <w:bCs w:val="false"/>
+          <w:i w:val="false"/>
+          <w:iCs w:val="false"/>
+          <w:sz w:val="22"/>
+          <w:szCs w:val="22"/>
+        </w:rPr>
+        <w:t xml:space="preserve">.)</w:t>
       </w:r>
     </w:p>
     <w:p>

</xml_diff>

<commit_message>
In-app full-database backup and restore
Reports page gains a Backup & restore card (admin-gated):
- Download backup: exports every table as one portable .json document
  (shared/api/lib/backupRestore.ts walks the schema, no mysql client
  needed inside the container)
- Restore: upload a backup, type REPLACE, enter the admin password —
  the current data is cleared and replaced in one transaction with FK
  checks suspended, auto-increment counters raised past restored ids,
  and a safety copy of the data being replaced downloads automatically
  before the restore runs

No deployment changes: uses the app's own DB connection, works on the
existing VPS compose as-is after grain-update. The nightly server-side
mysqump (grain-backup, 14 days) continues independently; the .json and
.sql.gz formats are not interchangeable. Smoke gains an export/restore
round-trip; verified gate-open 42/42 and gate-closed 44/44.
</commit_message>
<xml_diff>
--- a/Grain-Tracker-Install-Guide.docx
+++ b/Grain-Tracker-Install-Guide.docx
@@ -8691,14 +8691,67 @@
       <w:r>
         <w:rPr>
           <w:rFonts w:ascii="Calibri" w:cs="Calibri" w:eastAsia="Calibri" w:hAnsi="Calibri"/>
-          <w:b w:val="false"/>
-          <w:bCs w:val="false"/>
-          <w:i w:val="false"/>
-          <w:iCs w:val="false"/>
-          <w:sz w:val="22"/>
-          <w:szCs w:val="22"/>
-        </w:rPr>
-        <w:t xml:space="preserve">Take a fresh dump any time: </w:t>
+          <w:b/>
+          <w:bCs/>
+          <w:i w:val="false"/>
+          <w:iCs w:val="false"/>
+          <w:sz w:val="22"/>
+          <w:szCs w:val="22"/>
+        </w:rPr>
+        <w:t xml:space="preserve">Easiest — download a backup from inside the app</w:t>
+      </w:r>
+      <w:r>
+        <w:rPr>
+          <w:rFonts w:ascii="Calibri" w:cs="Calibri" w:eastAsia="Calibri" w:hAnsi="Calibri"/>
+          <w:b w:val="false"/>
+          <w:bCs w:val="false"/>
+          <w:i w:val="false"/>
+          <w:iCs w:val="false"/>
+          <w:sz w:val="22"/>
+          <w:szCs w:val="22"/>
+        </w:rPr>
+        <w:t xml:space="preserve">: Reports page →</w:t>
+      </w:r>
+    </w:p>
+    <w:p>
+      <w:pPr>
+        <w:spacing w:after="100" w:line="300"/>
+      </w:pPr>
+      <w:r>
+        <w:rPr>
+          <w:rFonts w:ascii="Calibri" w:cs="Calibri" w:eastAsia="Calibri" w:hAnsi="Calibri"/>
+          <w:b w:val="false"/>
+          <w:bCs w:val="false"/>
+          <w:i w:val="false"/>
+          <w:iCs w:val="false"/>
+          <w:sz w:val="22"/>
+          <w:szCs w:val="22"/>
+        </w:rPr>
+        <w:t xml:space="preserve">   </w:t>
+      </w:r>
+      <w:r>
+        <w:rPr>
+          <w:rFonts w:ascii="Calibri" w:cs="Calibri" w:eastAsia="Calibri" w:hAnsi="Calibri"/>
+          <w:b/>
+          <w:bCs/>
+          <w:i w:val="false"/>
+          <w:iCs w:val="false"/>
+          <w:sz w:val="22"/>
+          <w:szCs w:val="22"/>
+        </w:rPr>
+        <w:t xml:space="preserve">Backup &amp; restore → Download backup</w:t>
+      </w:r>
+      <w:r>
+        <w:rPr>
+          <w:rFonts w:ascii="Calibri" w:cs="Calibri" w:eastAsia="Calibri" w:hAnsi="Calibri"/>
+          <w:b w:val="false"/>
+          <w:bCs w:val="false"/>
+          <w:i w:val="false"/>
+          <w:iCs w:val="false"/>
+          <w:sz w:val="22"/>
+          <w:szCs w:val="22"/>
+        </w:rPr>
+        <w:t xml:space="preserve">. Saves a </w:t>
       </w:r>
       <w:r>
         <w:rPr>
@@ -8710,7 +8763,36 @@
           <w:sz w:val="20"/>
           <w:szCs w:val="20"/>
         </w:rPr>
-        <w:t xml:space="preserve">sudo grain-backup</w:t>
+        <w:t xml:space="preserve">.json</w:t>
+      </w:r>
+      <w:r>
+        <w:rPr>
+          <w:rFonts w:ascii="Calibri" w:cs="Calibri" w:eastAsia="Calibri" w:hAnsi="Calibri"/>
+          <w:b w:val="false"/>
+          <w:bCs w:val="false"/>
+          <w:i w:val="false"/>
+          <w:iCs w:val="false"/>
+          <w:sz w:val="22"/>
+          <w:szCs w:val="22"/>
+        </w:rPr>
+        <w:t xml:space="preserve"> file with every</w:t>
+      </w:r>
+    </w:p>
+    <w:p>
+      <w:pPr>
+        <w:spacing w:after="100" w:line="300"/>
+      </w:pPr>
+      <w:r>
+        <w:rPr>
+          <w:rFonts w:ascii="Calibri" w:cs="Calibri" w:eastAsia="Calibri" w:hAnsi="Calibri"/>
+          <w:b w:val="false"/>
+          <w:bCs w:val="false"/>
+          <w:i w:val="false"/>
+          <w:iCs w:val="false"/>
+          <w:sz w:val="22"/>
+          <w:szCs w:val="22"/>
+        </w:rPr>
+        <w:t xml:space="preserve">   table (farmers, lots, sheets, loads, bins, settings) to your PC.</w:t>
       </w:r>
     </w:p>
     <w:p>
@@ -8737,7 +8819,31 @@
           <w:sz w:val="22"/>
           <w:szCs w:val="22"/>
         </w:rPr>
-        <w:t xml:space="preserve">Download it OFF the server (Bitvise → SFTP window →</w:t>
+        <w:t xml:space="preserve">The server </w:t>
+      </w:r>
+      <w:r>
+        <w:rPr>
+          <w:rFonts w:ascii="Calibri" w:cs="Calibri" w:eastAsia="Calibri" w:hAnsi="Calibri"/>
+          <w:b/>
+          <w:bCs/>
+          <w:i w:val="false"/>
+          <w:iCs w:val="false"/>
+          <w:sz w:val="22"/>
+          <w:szCs w:val="22"/>
+        </w:rPr>
+        <w:t xml:space="preserve">also</w:t>
+      </w:r>
+      <w:r>
+        <w:rPr>
+          <w:rFonts w:ascii="Calibri" w:cs="Calibri" w:eastAsia="Calibri" w:hAnsi="Calibri"/>
+          <w:b w:val="false"/>
+          <w:bCs w:val="false"/>
+          <w:i w:val="false"/>
+          <w:iCs w:val="false"/>
+          <w:sz w:val="22"/>
+          <w:szCs w:val="22"/>
+        </w:rPr>
+        <w:t xml:space="preserve"> takes its own SQL dump nightly at 01:00 into</w:t>
       </w:r>
     </w:p>
     <w:p>
@@ -8778,7 +8884,7 @@
           <w:sz w:val="22"/>
           <w:szCs w:val="22"/>
         </w:rPr>
-        <w:t xml:space="preserve">): grab the newest</w:t>
+        <w:t xml:space="preserve"> (14 days kept); take one on demand with</w:t>
       </w:r>
     </w:p>
     <w:p>
@@ -8807,63 +8913,19 @@
           <w:sz w:val="20"/>
           <w:szCs w:val="20"/>
         </w:rPr>
-        <w:t xml:space="preserve">graintracker-&lt;date&gt;.sql.gz</w:t>
-      </w:r>
-      <w:r>
-        <w:rPr>
-          <w:rFonts w:ascii="Calibri" w:cs="Calibri" w:eastAsia="Calibri" w:hAnsi="Calibri"/>
-          <w:b w:val="false"/>
-          <w:bCs w:val="false"/>
-          <w:i w:val="false"/>
-          <w:iCs w:val="false"/>
-          <w:sz w:val="22"/>
-          <w:szCs w:val="22"/>
-        </w:rPr>
-        <w:t xml:space="preserve"> to your PC. Weekly is fine; do it</w:t>
-      </w:r>
-    </w:p>
-    <w:p>
-      <w:pPr>
-        <w:spacing w:after="100" w:line="300"/>
-      </w:pPr>
-      <w:r>
-        <w:rPr>
-          <w:rFonts w:ascii="Calibri" w:cs="Calibri" w:eastAsia="Calibri" w:hAnsi="Calibri"/>
-          <w:b w:val="false"/>
-          <w:bCs w:val="false"/>
-          <w:i w:val="false"/>
-          <w:iCs w:val="false"/>
-          <w:sz w:val="22"/>
-          <w:szCs w:val="22"/>
-        </w:rPr>
-        <w:t xml:space="preserve">   before any planned wipe or provider migration.</w:t>
-      </w:r>
-    </w:p>
-    <w:p>
-      <w:pPr>
-        <w:spacing w:after="60" w:line="288"/>
-      </w:pPr>
-      <w:r>
-        <w:rPr>
-          <w:rFonts w:ascii="Calibri" w:cs="Calibri" w:eastAsia="Calibri" w:hAnsi="Calibri"/>
-          <w:b/>
-          <w:bCs/>
-          <w:sz w:val="22"/>
-          <w:szCs w:val="22"/>
-        </w:rPr>
-        <w:t xml:space="preserve">3. </w:t>
-      </w:r>
-      <w:r>
-        <w:rPr>
-          <w:rFonts w:ascii="Calibri" w:cs="Calibri" w:eastAsia="Calibri" w:hAnsi="Calibri"/>
-          <w:b w:val="false"/>
-          <w:bCs w:val="false"/>
-          <w:i w:val="false"/>
-          <w:iCs w:val="false"/>
-          <w:sz w:val="22"/>
-          <w:szCs w:val="22"/>
-        </w:rPr>
-        <w:t xml:space="preserve">Optional but handy: save a copy of </w:t>
+        <w:t xml:space="preserve">sudo grain-backup</w:t>
+      </w:r>
+      <w:r>
+        <w:rPr>
+          <w:rFonts w:ascii="Calibri" w:cs="Calibri" w:eastAsia="Calibri" w:hAnsi="Calibri"/>
+          <w:b w:val="false"/>
+          <w:bCs w:val="false"/>
+          <w:i w:val="false"/>
+          <w:iCs w:val="false"/>
+          <w:sz w:val="22"/>
+          <w:szCs w:val="22"/>
+        </w:rPr>
+        <w:t xml:space="preserve"> and download it via SFTP — that </w:t>
       </w:r>
       <w:r>
         <w:rPr>
@@ -8875,24 +8937,63 @@
           <w:sz w:val="20"/>
           <w:szCs w:val="20"/>
         </w:rPr>
-        <w:t xml:space="preserve">/opt/gtv9-deploy/.env</w:t>
-      </w:r>
-    </w:p>
-    <w:p>
-      <w:pPr>
-        <w:spacing w:after="100" w:line="300"/>
-      </w:pPr>
-      <w:r>
-        <w:rPr>
-          <w:rFonts w:ascii="Calibri" w:cs="Calibri" w:eastAsia="Calibri" w:hAnsi="Calibri"/>
-          <w:b w:val="false"/>
-          <w:bCs w:val="false"/>
-          <w:i w:val="false"/>
-          <w:iCs w:val="false"/>
-          <w:sz w:val="22"/>
-          <w:szCs w:val="22"/>
-        </w:rPr>
-        <w:t xml:space="preserve">   (</w:t>
+        <w:t xml:space="preserve">.sql.gz</w:t>
+      </w:r>
+      <w:r>
+        <w:rPr>
+          <w:rFonts w:ascii="Calibri" w:cs="Calibri" w:eastAsia="Calibri" w:hAnsi="Calibri"/>
+          <w:b w:val="false"/>
+          <w:bCs w:val="false"/>
+          <w:i w:val="false"/>
+          <w:iCs w:val="false"/>
+          <w:sz w:val="22"/>
+          <w:szCs w:val="22"/>
+        </w:rPr>
+        <w:t xml:space="preserve"> format is</w:t>
+      </w:r>
+    </w:p>
+    <w:p>
+      <w:pPr>
+        <w:spacing w:after="100" w:line="300"/>
+      </w:pPr>
+      <w:r>
+        <w:rPr>
+          <w:rFonts w:ascii="Calibri" w:cs="Calibri" w:eastAsia="Calibri" w:hAnsi="Calibri"/>
+          <w:b w:val="false"/>
+          <w:bCs w:val="false"/>
+          <w:i w:val="false"/>
+          <w:iCs w:val="false"/>
+          <w:sz w:val="22"/>
+          <w:szCs w:val="22"/>
+        </w:rPr>
+        <w:t xml:space="preserve">   the fallback route, see the restore note below.</w:t>
+      </w:r>
+    </w:p>
+    <w:p>
+      <w:pPr>
+        <w:spacing w:after="60" w:line="288"/>
+      </w:pPr>
+      <w:r>
+        <w:rPr>
+          <w:rFonts w:ascii="Calibri" w:cs="Calibri" w:eastAsia="Calibri" w:hAnsi="Calibri"/>
+          <w:b/>
+          <w:bCs/>
+          <w:sz w:val="22"/>
+          <w:szCs w:val="22"/>
+        </w:rPr>
+        <w:t xml:space="preserve">3. </w:t>
+      </w:r>
+      <w:r>
+        <w:rPr>
+          <w:rFonts w:ascii="Calibri" w:cs="Calibri" w:eastAsia="Calibri" w:hAnsi="Calibri"/>
+          <w:b w:val="false"/>
+          <w:bCs w:val="false"/>
+          <w:i w:val="false"/>
+          <w:iCs w:val="false"/>
+          <w:sz w:val="22"/>
+          <w:szCs w:val="22"/>
+        </w:rPr>
+        <w:t xml:space="preserve">Optional but handy: save a copy of </w:t>
       </w:r>
       <w:r>
         <w:rPr>
@@ -8904,6 +9005,35 @@
           <w:sz w:val="20"/>
           <w:szCs w:val="20"/>
         </w:rPr>
+        <w:t xml:space="preserve">/opt/gtv9-deploy/.env</w:t>
+      </w:r>
+    </w:p>
+    <w:p>
+      <w:pPr>
+        <w:spacing w:after="100" w:line="300"/>
+      </w:pPr>
+      <w:r>
+        <w:rPr>
+          <w:rFonts w:ascii="Calibri" w:cs="Calibri" w:eastAsia="Calibri" w:hAnsi="Calibri"/>
+          <w:b w:val="false"/>
+          <w:bCs w:val="false"/>
+          <w:i w:val="false"/>
+          <w:iCs w:val="false"/>
+          <w:sz w:val="22"/>
+          <w:szCs w:val="22"/>
+        </w:rPr>
+        <w:t xml:space="preserve">   (</w:t>
+      </w:r>
+      <w:r>
+        <w:rPr>
+          <w:rFonts w:ascii="Courier New" w:cs="Courier New" w:eastAsia="Courier New" w:hAnsi="Courier New"/>
+          <w:b w:val="false"/>
+          <w:bCs w:val="false"/>
+          <w:i w:val="false"/>
+          <w:iCs w:val="false"/>
+          <w:sz w:val="20"/>
+          <w:szCs w:val="20"/>
+        </w:rPr>
         <w:t xml:space="preserve">sudo cat /opt/gtv9-deploy/.env &gt; gtv9-env-backup.txt</w:t>
       </w:r>
       <w:r>
@@ -9362,31 +9492,26 @@
       <w:r>
         <w:rPr>
           <w:rFonts w:ascii="Calibri" w:cs="Calibri" w:eastAsia="Calibri" w:hAnsi="Calibri"/>
-          <w:b w:val="false"/>
-          <w:bCs w:val="false"/>
-          <w:i w:val="false"/>
-          <w:iCs w:val="false"/>
-          <w:sz w:val="22"/>
-          <w:szCs w:val="22"/>
-        </w:rPr>
-        <w:t xml:space="preserve">Upload your saved dump back to the server (Bitvise SFTP → drop</w:t>
-      </w:r>
-    </w:p>
-    <w:p>
-      <w:pPr>
-        <w:spacing w:after="100" w:line="300"/>
-      </w:pPr>
-      <w:r>
-        <w:rPr>
-          <w:rFonts w:ascii="Calibri" w:cs="Calibri" w:eastAsia="Calibri" w:hAnsi="Calibri"/>
-          <w:b w:val="false"/>
-          <w:bCs w:val="false"/>
-          <w:i w:val="false"/>
-          <w:iCs w:val="false"/>
-          <w:sz w:val="22"/>
-          <w:szCs w:val="22"/>
-        </w:rPr>
-        <w:t xml:space="preserve">   </w:t>
+          <w:b/>
+          <w:bCs/>
+          <w:i w:val="false"/>
+          <w:iCs w:val="false"/>
+          <w:sz w:val="22"/>
+          <w:szCs w:val="22"/>
+        </w:rPr>
+        <w:t xml:space="preserve">Restore your data from inside the app</w:t>
+      </w:r>
+      <w:r>
+        <w:rPr>
+          <w:rFonts w:ascii="Calibri" w:cs="Calibri" w:eastAsia="Calibri" w:hAnsi="Calibri"/>
+          <w:b w:val="false"/>
+          <w:bCs w:val="false"/>
+          <w:i w:val="false"/>
+          <w:iCs w:val="false"/>
+          <w:sz w:val="22"/>
+          <w:szCs w:val="22"/>
+        </w:rPr>
+        <w:t xml:space="preserve"> (the </w:t>
       </w:r>
       <w:r>
         <w:rPr>
@@ -9398,312 +9523,396 @@
           <w:sz w:val="20"/>
           <w:szCs w:val="20"/>
         </w:rPr>
-        <w:t xml:space="preserve">graintracker-&lt;date&gt;.sql.gz</w:t>
-      </w:r>
-      <w:r>
-        <w:rPr>
-          <w:rFonts w:ascii="Calibri" w:cs="Calibri" w:eastAsia="Calibri" w:hAnsi="Calibri"/>
-          <w:b w:val="false"/>
-          <w:bCs w:val="false"/>
-          <w:i w:val="false"/>
-          <w:iCs w:val="false"/>
-          <w:sz w:val="22"/>
-          <w:szCs w:val="22"/>
-        </w:rPr>
-        <w:t xml:space="preserve"> into </w:t>
-      </w:r>
+        <w:t xml:space="preserve">.json</w:t>
+      </w:r>
+      <w:r>
+        <w:rPr>
+          <w:rFonts w:ascii="Calibri" w:cs="Calibri" w:eastAsia="Calibri" w:hAnsi="Calibri"/>
+          <w:b w:val="false"/>
+          <w:bCs w:val="false"/>
+          <w:i w:val="false"/>
+          <w:iCs w:val="false"/>
+          <w:sz w:val="22"/>
+          <w:szCs w:val="22"/>
+        </w:rPr>
+        <w:t xml:space="preserve"> backup from</w:t>
+      </w:r>
+    </w:p>
+    <w:p>
+      <w:pPr>
+        <w:spacing w:after="100" w:line="300"/>
+      </w:pPr>
+      <w:r>
+        <w:rPr>
+          <w:rFonts w:ascii="Calibri" w:cs="Calibri" w:eastAsia="Calibri" w:hAnsi="Calibri"/>
+          <w:b w:val="false"/>
+          <w:bCs w:val="false"/>
+          <w:i w:val="false"/>
+          <w:iCs w:val="false"/>
+          <w:sz w:val="22"/>
+          <w:szCs w:val="22"/>
+        </w:rPr>
+        <w:t xml:space="preserve">   step 1 of "Before the server dies"): open **Reports → Backup &amp;</w:t>
+      </w:r>
+    </w:p>
+    <w:p>
+      <w:pPr>
+        <w:spacing w:after="100" w:line="300"/>
+      </w:pPr>
+      <w:r>
+        <w:rPr>
+          <w:rFonts w:ascii="Calibri" w:cs="Calibri" w:eastAsia="Calibri" w:hAnsi="Calibri"/>
+          <w:b w:val="false"/>
+          <w:bCs w:val="false"/>
+          <w:i w:val="false"/>
+          <w:iCs w:val="false"/>
+          <w:sz w:val="22"/>
+          <w:szCs w:val="22"/>
+        </w:rPr>
+        <w:t xml:space="preserve">   restore</w:t>
+      </w:r>
+      <w:r>
+        <w:rPr>
+          <w:rFonts w:ascii="Calibri" w:cs="Calibri" w:eastAsia="Calibri" w:hAnsi="Calibri"/>
+          <w:b/>
+          <w:bCs/>
+          <w:i w:val="false"/>
+          <w:iCs w:val="false"/>
+          <w:sz w:val="22"/>
+          <w:szCs w:val="22"/>
+        </w:rPr>
+        <w:t xml:space="preserve">, choose the file, type </w:t>
+      </w:r>
+      <w:r>
+        <w:rPr>
+          <w:rFonts w:ascii="Calibri" w:cs="Calibri" w:eastAsia="Calibri" w:hAnsi="Calibri"/>
+          <w:b w:val="false"/>
+          <w:bCs w:val="false"/>
+          <w:i w:val="false"/>
+          <w:iCs w:val="false"/>
+          <w:sz w:val="22"/>
+          <w:szCs w:val="22"/>
+        </w:rPr>
+        <w:t xml:space="preserve">REPLACE**, enter the app admin</w:t>
+      </w:r>
+    </w:p>
+    <w:p>
+      <w:pPr>
+        <w:spacing w:after="100" w:line="300"/>
+      </w:pPr>
+      <w:r>
+        <w:rPr>
+          <w:rFonts w:ascii="Calibri" w:cs="Calibri" w:eastAsia="Calibri" w:hAnsi="Calibri"/>
+          <w:b w:val="false"/>
+          <w:bCs w:val="false"/>
+          <w:i w:val="false"/>
+          <w:iCs w:val="false"/>
+          <w:sz w:val="22"/>
+          <w:szCs w:val="22"/>
+        </w:rPr>
+        <w:t xml:space="preserve">   password, and click </w:t>
+      </w:r>
+      <w:r>
+        <w:rPr>
+          <w:rFonts w:ascii="Calibri" w:cs="Calibri" w:eastAsia="Calibri" w:hAnsi="Calibri"/>
+          <w:b/>
+          <w:bCs/>
+          <w:i w:val="false"/>
+          <w:iCs w:val="false"/>
+          <w:sz w:val="22"/>
+          <w:szCs w:val="22"/>
+        </w:rPr>
+        <w:t xml:space="preserve">Restore database</w:t>
+      </w:r>
+      <w:r>
+        <w:rPr>
+          <w:rFonts w:ascii="Calibri" w:cs="Calibri" w:eastAsia="Calibri" w:hAnsi="Calibri"/>
+          <w:b w:val="false"/>
+          <w:bCs w:val="false"/>
+          <w:i w:val="false"/>
+          <w:iCs w:val="false"/>
+          <w:sz w:val="22"/>
+          <w:szCs w:val="22"/>
+        </w:rPr>
+        <w:t xml:space="preserve">. A safety copy of the</w:t>
+      </w:r>
+    </w:p>
+    <w:p>
+      <w:pPr>
+        <w:spacing w:after="100" w:line="300"/>
+      </w:pPr>
+      <w:r>
+        <w:rPr>
+          <w:rFonts w:ascii="Calibri" w:cs="Calibri" w:eastAsia="Calibri" w:hAnsi="Calibri"/>
+          <w:b w:val="false"/>
+          <w:bCs w:val="false"/>
+          <w:i w:val="false"/>
+          <w:iCs w:val="false"/>
+          <w:sz w:val="22"/>
+          <w:szCs w:val="22"/>
+        </w:rPr>
+        <w:t xml:space="preserve">   (empty) current data downloads automatically first. Every farmer,</w:t>
+      </w:r>
+    </w:p>
+    <w:p>
+      <w:pPr>
+        <w:spacing w:after="100" w:line="300"/>
+      </w:pPr>
+      <w:r>
+        <w:rPr>
+          <w:rFonts w:ascii="Calibri" w:cs="Calibri" w:eastAsia="Calibri" w:hAnsi="Calibri"/>
+          <w:b w:val="false"/>
+          <w:bCs w:val="false"/>
+          <w:i w:val="false"/>
+          <w:iCs w:val="false"/>
+          <w:sz w:val="22"/>
+          <w:szCs w:val="22"/>
+        </w:rPr>
+        <w:t xml:space="preserve">   lot, weight sheet, load, and bin level comes back.</w:t>
+      </w:r>
+    </w:p>
+    <w:p>
+      <w:pPr>
+        <w:spacing w:after="60" w:line="288"/>
+      </w:pPr>
+      <w:r>
+        <w:rPr>
+          <w:rFonts w:ascii="Calibri" w:cs="Calibri" w:eastAsia="Calibri" w:hAnsi="Calibri"/>
+          <w:b/>
+          <w:bCs/>
+          <w:sz w:val="22"/>
+          <w:szCs w:val="22"/>
+        </w:rPr>
+        <w:t xml:space="preserve">4. </w:t>
+      </w:r>
+      <w:r>
+        <w:rPr>
+          <w:rFonts w:ascii="Calibri" w:cs="Calibri" w:eastAsia="Calibri" w:hAnsi="Calibri"/>
+          <w:b w:val="false"/>
+          <w:bCs w:val="false"/>
+          <w:i w:val="false"/>
+          <w:iCs w:val="false"/>
+          <w:sz w:val="22"/>
+          <w:szCs w:val="22"/>
+        </w:rPr>
+        <w:t xml:space="preserve">If you had a custom app admin password, re-set it and restart the app:</w:t>
+      </w:r>
+    </w:p>
+    <w:p>
+      <w:pPr>
+        <w:spacing w:after="100" w:line="300"/>
+      </w:pPr>
+      <w:r>
+        <w:rPr>
+          <w:rFonts w:ascii="Calibri" w:cs="Calibri" w:eastAsia="Calibri" w:hAnsi="Calibri"/>
+          <w:b w:val="false"/>
+          <w:bCs w:val="false"/>
+          <w:i w:val="false"/>
+          <w:iCs w:val="false"/>
+          <w:sz w:val="22"/>
+          <w:szCs w:val="22"/>
+        </w:rPr>
+        <w:t xml:space="preserve">   ```bash</w:t>
+      </w:r>
+    </w:p>
+    <w:p>
+      <w:pPr>
+        <w:spacing w:after="100" w:line="300"/>
+      </w:pPr>
+      <w:r>
+        <w:rPr>
+          <w:rFonts w:ascii="Calibri" w:cs="Calibri" w:eastAsia="Calibri" w:hAnsi="Calibri"/>
+          <w:b w:val="false"/>
+          <w:bCs w:val="false"/>
+          <w:i w:val="false"/>
+          <w:iCs w:val="false"/>
+          <w:sz w:val="22"/>
+          <w:szCs w:val="22"/>
+        </w:rPr>
+        <w:t xml:space="preserve">   sudo sed -i 's|^ADMIN_PASSWORD=.*|ADMIN_PASSWORD=YourAppPassword|' /opt/gtv9-deploy/.env</w:t>
+      </w:r>
+    </w:p>
+    <w:p>
+      <w:pPr>
+        <w:spacing w:after="100" w:line="300"/>
+      </w:pPr>
+      <w:r>
+        <w:rPr>
+          <w:rFonts w:ascii="Calibri" w:cs="Calibri" w:eastAsia="Calibri" w:hAnsi="Calibri"/>
+          <w:b w:val="false"/>
+          <w:bCs w:val="false"/>
+          <w:i w:val="false"/>
+          <w:iCs w:val="false"/>
+          <w:sz w:val="22"/>
+          <w:szCs w:val="22"/>
+        </w:rPr>
+        <w:t xml:space="preserve">   cd /opt/gtv9-deploy &amp;&amp; docker compose up -d --force-recreate app</w:t>
+      </w:r>
+    </w:p>
+    <w:p>
+      <w:pPr>
+        <w:spacing w:after="100" w:line="300"/>
+      </w:pPr>
+      <w:r>
+        <w:rPr>
+          <w:rFonts w:ascii="Calibri" w:cs="Calibri" w:eastAsia="Calibri" w:hAnsi="Calibri"/>
+          <w:b w:val="false"/>
+          <w:bCs w:val="false"/>
+          <w:i w:val="false"/>
+          <w:iCs w:val="false"/>
+          <w:sz w:val="22"/>
+          <w:szCs w:val="22"/>
+        </w:rPr>
+        <w:t xml:space="preserve">   ```</w:t>
+      </w:r>
+    </w:p>
+    <w:p>
+      <w:pPr>
+        <w:spacing w:after="60" w:line="288"/>
+      </w:pPr>
+      <w:r>
+        <w:rPr>
+          <w:rFonts w:ascii="Calibri" w:cs="Calibri" w:eastAsia="Calibri" w:hAnsi="Calibri"/>
+          <w:b/>
+          <w:bCs/>
+          <w:sz w:val="22"/>
+          <w:szCs w:val="22"/>
+        </w:rPr>
+        <w:t xml:space="preserve">5. </w:t>
+      </w:r>
+      <w:r>
+        <w:rPr>
+          <w:rFonts w:ascii="Calibri" w:cs="Calibri" w:eastAsia="Calibri" w:hAnsi="Calibri"/>
+          <w:b w:val="false"/>
+          <w:bCs w:val="false"/>
+          <w:i w:val="false"/>
+          <w:iCs w:val="false"/>
+          <w:sz w:val="22"/>
+          <w:szCs w:val="22"/>
+        </w:rPr>
+        <w:t xml:space="preserve">Verify in the browser: dashboard, a farmer, a sheet, bin levels.</w:t>
+      </w:r>
+    </w:p>
+    <w:p>
+      <w:pPr>
+        <w:spacing w:after="100" w:line="300"/>
+      </w:pPr>
+      <w:r>
+        <w:rPr>
+          <w:rFonts w:ascii="Calibri" w:cs="Calibri" w:eastAsia="Calibri" w:hAnsi="Calibri"/>
+          <w:b w:val="false"/>
+          <w:bCs w:val="false"/>
+          <w:i w:val="false"/>
+          <w:iCs w:val="false"/>
+          <w:sz w:val="22"/>
+          <w:szCs w:val="22"/>
+        </w:rPr>
+        <w:t xml:space="preserve">   Office-sync settings live in the database, so they come back with the</w:t>
+      </w:r>
+    </w:p>
+    <w:p>
+      <w:pPr>
+        <w:spacing w:after="100" w:line="300"/>
+      </w:pPr>
+      <w:r>
+        <w:rPr>
+          <w:rFonts w:ascii="Calibri" w:cs="Calibri" w:eastAsia="Calibri" w:hAnsi="Calibri"/>
+          <w:b w:val="false"/>
+          <w:bCs w:val="false"/>
+          <w:i w:val="false"/>
+          <w:iCs w:val="false"/>
+          <w:sz w:val="22"/>
+          <w:szCs w:val="22"/>
+        </w:rPr>
+        <w:t xml:space="preserve">   restore automatically.</w:t>
+      </w:r>
+    </w:p>
+    <w:p>
+      <w:pPr>
+        <w:spacing w:after="80"/>
+      </w:pPr>
+    </w:p>
+    <w:p>
+      <w:pPr>
+        <w:spacing w:after="100" w:line="300"/>
+      </w:pPr>
+      <w:r>
+        <w:rPr>
+          <w:rFonts w:ascii="Calibri" w:cs="Calibri" w:eastAsia="Calibri" w:hAnsi="Calibri"/>
+          <w:b/>
+          <w:bCs/>
+          <w:i w:val="false"/>
+          <w:iCs w:val="false"/>
+          <w:sz w:val="22"/>
+          <w:szCs w:val="22"/>
+        </w:rPr>
+        <w:t xml:space="preserve">Only have the old `.sql.gz` dump</w:t>
+      </w:r>
+      <w:r>
+        <w:rPr>
+          <w:rFonts w:ascii="Calibri" w:cs="Calibri" w:eastAsia="Calibri" w:hAnsi="Calibri"/>
+          <w:b w:val="false"/>
+          <w:bCs w:val="false"/>
+          <w:i w:val="false"/>
+          <w:iCs w:val="false"/>
+          <w:sz w:val="22"/>
+          <w:szCs w:val="22"/>
+        </w:rPr>
+        <w:t xml:space="preserve"> (backups taken before the in-app</w:t>
+      </w:r>
+    </w:p>
+    <w:p>
+      <w:pPr>
+        <w:spacing w:after="100" w:line="300"/>
+      </w:pPr>
+      <w:r>
+        <w:rPr>
+          <w:rFonts w:ascii="Calibri" w:cs="Calibri" w:eastAsia="Calibri" w:hAnsi="Calibri"/>
+          <w:b w:val="false"/>
+          <w:bCs w:val="false"/>
+          <w:i w:val="false"/>
+          <w:iCs w:val="false"/>
+          <w:sz w:val="22"/>
+          <w:szCs w:val="22"/>
+        </w:rPr>
+        <w:t xml:space="preserve">restore existed)? SFTP it up and restore via the MySQL container:</w:t>
+      </w:r>
+    </w:p>
+    <w:p>
+      <w:pPr>
+        <w:spacing w:after="80"/>
+      </w:pPr>
+    </w:p>
+    <w:p>
+      <w:pPr>
+        <w:spacing w:after="0" w:before="0" w:line="240"/>
+      </w:pPr>
       <w:r>
         <w:rPr>
           <w:rFonts w:ascii="Courier New" w:cs="Courier New" w:eastAsia="Courier New" w:hAnsi="Courier New"/>
-          <w:b w:val="false"/>
-          <w:bCs w:val="false"/>
-          <w:i w:val="false"/>
-          <w:iCs w:val="false"/>
-          <w:sz w:val="20"/>
-          <w:szCs w:val="20"/>
-        </w:rPr>
-        <w:t xml:space="preserve">/home/vpsadmin/</w:t>
-      </w:r>
-      <w:r>
-        <w:rPr>
-          <w:rFonts w:ascii="Calibri" w:cs="Calibri" w:eastAsia="Calibri" w:hAnsi="Calibri"/>
-          <w:b w:val="false"/>
-          <w:bCs w:val="false"/>
-          <w:i w:val="false"/>
-          <w:iCs w:val="false"/>
-          <w:sz w:val="22"/>
-          <w:szCs w:val="22"/>
-        </w:rPr>
-        <w:t xml:space="preserve">).</w:t>
-      </w:r>
-    </w:p>
-    <w:p>
-      <w:pPr>
-        <w:spacing w:after="60" w:line="288"/>
-      </w:pPr>
-      <w:r>
-        <w:rPr>
-          <w:rFonts w:ascii="Calibri" w:cs="Calibri" w:eastAsia="Calibri" w:hAnsi="Calibri"/>
-          <w:b/>
-          <w:bCs/>
-          <w:sz w:val="22"/>
-          <w:szCs w:val="22"/>
-        </w:rPr>
-        <w:t xml:space="preserve">4. </w:t>
-      </w:r>
-      <w:r>
-        <w:rPr>
-          <w:rFonts w:ascii="Calibri" w:cs="Calibri" w:eastAsia="Calibri" w:hAnsi="Calibri"/>
-          <w:b w:val="false"/>
-          <w:bCs w:val="false"/>
-          <w:i w:val="false"/>
-          <w:iCs w:val="false"/>
-          <w:sz w:val="22"/>
-          <w:szCs w:val="22"/>
-        </w:rPr>
-        <w:t xml:space="preserve">Restore the data into the fresh database:</w:t>
-      </w:r>
-    </w:p>
-    <w:p>
-      <w:pPr>
-        <w:spacing w:after="100" w:line="300"/>
-      </w:pPr>
-      <w:r>
-        <w:rPr>
-          <w:rFonts w:ascii="Calibri" w:cs="Calibri" w:eastAsia="Calibri" w:hAnsi="Calibri"/>
-          <w:b w:val="false"/>
-          <w:bCs w:val="false"/>
-          <w:i w:val="false"/>
-          <w:iCs w:val="false"/>
-          <w:sz w:val="22"/>
-          <w:szCs w:val="22"/>
-        </w:rPr>
-        <w:t xml:space="preserve">   ```bash</w:t>
-      </w:r>
-    </w:p>
-    <w:p>
-      <w:pPr>
-        <w:spacing w:after="100" w:line="300"/>
-      </w:pPr>
-      <w:r>
-        <w:rPr>
-          <w:rFonts w:ascii="Calibri" w:cs="Calibri" w:eastAsia="Calibri" w:hAnsi="Calibri"/>
-          <w:b w:val="false"/>
-          <w:bCs w:val="false"/>
-          <w:i w:val="false"/>
-          <w:iCs w:val="false"/>
-          <w:sz w:val="22"/>
-          <w:szCs w:val="22"/>
-        </w:rPr>
-        <w:t xml:space="preserve">   gunzip &lt; /home/vpsadmin/graintracker-&lt;date&gt;.sql.gz | \</w:t>
-      </w:r>
-    </w:p>
-    <w:p>
-      <w:pPr>
-        <w:spacing w:after="100" w:line="300"/>
-      </w:pPr>
-      <w:r>
-        <w:rPr>
-          <w:rFonts w:ascii="Calibri" w:cs="Calibri" w:eastAsia="Calibri" w:hAnsi="Calibri"/>
-          <w:b w:val="false"/>
-          <w:bCs w:val="false"/>
-          <w:i w:val="false"/>
-          <w:iCs w:val="false"/>
-          <w:sz w:val="22"/>
-          <w:szCs w:val="22"/>
-        </w:rPr>
-        <w:t xml:space="preserve">     docker exec -i grain-mysql sh -c 'exec mysql -uroot -p"$MYSQL_ROOT_PASSWORD" graintracker'</w:t>
-      </w:r>
-    </w:p>
-    <w:p>
-      <w:pPr>
-        <w:spacing w:after="100" w:line="300"/>
-      </w:pPr>
-      <w:r>
-        <w:rPr>
-          <w:rFonts w:ascii="Calibri" w:cs="Calibri" w:eastAsia="Calibri" w:hAnsi="Calibri"/>
-          <w:b w:val="false"/>
-          <w:bCs w:val="false"/>
-          <w:i w:val="false"/>
-          <w:iCs w:val="false"/>
-          <w:sz w:val="22"/>
-          <w:szCs w:val="22"/>
-        </w:rPr>
-        <w:t xml:space="preserve">   ```</w:t>
-      </w:r>
-    </w:p>
-    <w:p>
-      <w:pPr>
-        <w:spacing w:after="100" w:line="300"/>
-      </w:pPr>
-      <w:r>
-        <w:rPr>
-          <w:rFonts w:ascii="Calibri" w:cs="Calibri" w:eastAsia="Calibri" w:hAnsi="Calibri"/>
-          <w:b w:val="false"/>
-          <w:bCs w:val="false"/>
-          <w:i w:val="false"/>
-          <w:iCs w:val="false"/>
-          <w:sz w:val="22"/>
-          <w:szCs w:val="22"/>
-        </w:rPr>
-        <w:t xml:space="preserve">   That brings back every farmer, lot, weight sheet, load, and bin level.</w:t>
-      </w:r>
-    </w:p>
-    <w:p>
-      <w:pPr>
-        <w:spacing w:after="60" w:line="288"/>
-      </w:pPr>
-      <w:r>
-        <w:rPr>
-          <w:rFonts w:ascii="Calibri" w:cs="Calibri" w:eastAsia="Calibri" w:hAnsi="Calibri"/>
-          <w:b/>
-          <w:bCs/>
-          <w:sz w:val="22"/>
-          <w:szCs w:val="22"/>
-        </w:rPr>
-        <w:t xml:space="preserve">5. </w:t>
-      </w:r>
-      <w:r>
-        <w:rPr>
-          <w:rFonts w:ascii="Calibri" w:cs="Calibri" w:eastAsia="Calibri" w:hAnsi="Calibri"/>
-          <w:b w:val="false"/>
-          <w:bCs w:val="false"/>
-          <w:i w:val="false"/>
-          <w:iCs w:val="false"/>
-          <w:sz w:val="22"/>
-          <w:szCs w:val="22"/>
-        </w:rPr>
-        <w:t xml:space="preserve">If you had a custom app admin password, re-set it and restart the app:</w:t>
-      </w:r>
-    </w:p>
-    <w:p>
-      <w:pPr>
-        <w:spacing w:after="100" w:line="300"/>
-      </w:pPr>
-      <w:r>
-        <w:rPr>
-          <w:rFonts w:ascii="Calibri" w:cs="Calibri" w:eastAsia="Calibri" w:hAnsi="Calibri"/>
-          <w:b w:val="false"/>
-          <w:bCs w:val="false"/>
-          <w:i w:val="false"/>
-          <w:iCs w:val="false"/>
-          <w:sz w:val="22"/>
-          <w:szCs w:val="22"/>
-        </w:rPr>
-        <w:t xml:space="preserve">   ```bash</w:t>
-      </w:r>
-    </w:p>
-    <w:p>
-      <w:pPr>
-        <w:spacing w:after="100" w:line="300"/>
-      </w:pPr>
-      <w:r>
-        <w:rPr>
-          <w:rFonts w:ascii="Calibri" w:cs="Calibri" w:eastAsia="Calibri" w:hAnsi="Calibri"/>
-          <w:b w:val="false"/>
-          <w:bCs w:val="false"/>
-          <w:i w:val="false"/>
-          <w:iCs w:val="false"/>
-          <w:sz w:val="22"/>
-          <w:szCs w:val="22"/>
-        </w:rPr>
-        <w:t xml:space="preserve">   sudo sed -i 's|^ADMIN_PASSWORD=.*|ADMIN_PASSWORD=YourAppPassword|' /opt/gtv9-deploy/.env</w:t>
-      </w:r>
-    </w:p>
-    <w:p>
-      <w:pPr>
-        <w:spacing w:after="100" w:line="300"/>
-      </w:pPr>
-      <w:r>
-        <w:rPr>
-          <w:rFonts w:ascii="Calibri" w:cs="Calibri" w:eastAsia="Calibri" w:hAnsi="Calibri"/>
-          <w:b w:val="false"/>
-          <w:bCs w:val="false"/>
-          <w:i w:val="false"/>
-          <w:iCs w:val="false"/>
-          <w:sz w:val="22"/>
-          <w:szCs w:val="22"/>
-        </w:rPr>
-        <w:t xml:space="preserve">   cd /opt/gtv9-deploy &amp;&amp; docker compose up -d --force-recreate app</w:t>
-      </w:r>
-    </w:p>
-    <w:p>
-      <w:pPr>
-        <w:spacing w:after="100" w:line="300"/>
-      </w:pPr>
-      <w:r>
-        <w:rPr>
-          <w:rFonts w:ascii="Calibri" w:cs="Calibri" w:eastAsia="Calibri" w:hAnsi="Calibri"/>
-          <w:b w:val="false"/>
-          <w:bCs w:val="false"/>
-          <w:i w:val="false"/>
-          <w:iCs w:val="false"/>
-          <w:sz w:val="22"/>
-          <w:szCs w:val="22"/>
-        </w:rPr>
-        <w:t xml:space="preserve">   ```</w:t>
-      </w:r>
-    </w:p>
-    <w:p>
-      <w:pPr>
-        <w:spacing w:after="60" w:line="288"/>
-      </w:pPr>
-      <w:r>
-        <w:rPr>
-          <w:rFonts w:ascii="Calibri" w:cs="Calibri" w:eastAsia="Calibri" w:hAnsi="Calibri"/>
-          <w:b/>
-          <w:bCs/>
-          <w:sz w:val="22"/>
-          <w:szCs w:val="22"/>
-        </w:rPr>
-        <w:t xml:space="preserve">6. </w:t>
-      </w:r>
-      <w:r>
-        <w:rPr>
-          <w:rFonts w:ascii="Calibri" w:cs="Calibri" w:eastAsia="Calibri" w:hAnsi="Calibri"/>
-          <w:b w:val="false"/>
-          <w:bCs w:val="false"/>
-          <w:i w:val="false"/>
-          <w:iCs w:val="false"/>
-          <w:sz w:val="22"/>
-          <w:szCs w:val="22"/>
-        </w:rPr>
-        <w:t xml:space="preserve">Verify in the browser: dashboard, a farmer, a sheet, bin levels.</w:t>
-      </w:r>
-    </w:p>
-    <w:p>
-      <w:pPr>
-        <w:spacing w:after="100" w:line="300"/>
-      </w:pPr>
-      <w:r>
-        <w:rPr>
-          <w:rFonts w:ascii="Calibri" w:cs="Calibri" w:eastAsia="Calibri" w:hAnsi="Calibri"/>
-          <w:b w:val="false"/>
-          <w:bCs w:val="false"/>
-          <w:i w:val="false"/>
-          <w:iCs w:val="false"/>
-          <w:sz w:val="22"/>
-          <w:szCs w:val="22"/>
-        </w:rPr>
-        <w:t xml:space="preserve">   Office-sync settings live in the database, so they come back with the</w:t>
-      </w:r>
-    </w:p>
-    <w:p>
-      <w:pPr>
-        <w:spacing w:after="100" w:line="300"/>
-      </w:pPr>
-      <w:r>
-        <w:rPr>
-          <w:rFonts w:ascii="Calibri" w:cs="Calibri" w:eastAsia="Calibri" w:hAnsi="Calibri"/>
-          <w:b w:val="false"/>
-          <w:bCs w:val="false"/>
-          <w:i w:val="false"/>
-          <w:iCs w:val="false"/>
-          <w:sz w:val="22"/>
-          <w:szCs w:val="22"/>
-        </w:rPr>
-        <w:t xml:space="preserve">   restore automatically.</w:t>
-      </w:r>
+          <w:sz w:val="18"/>
+          <w:szCs w:val="18"/>
+        </w:rPr>
+        <w:t xml:space="preserve">gunzip &lt; /home/vpsadmin/graintracker-&lt;date&gt;.sql.gz | \</w:t>
+      </w:r>
+    </w:p>
+    <w:p>
+      <w:pPr>
+        <w:spacing w:after="0" w:before="0" w:line="240"/>
+      </w:pPr>
+      <w:r>
+        <w:rPr>
+          <w:rFonts w:ascii="Courier New" w:cs="Courier New" w:eastAsia="Courier New" w:hAnsi="Courier New"/>
+          <w:sz w:val="18"/>
+          <w:szCs w:val="18"/>
+        </w:rPr>
+        <w:t xml:space="preserve">  docker exec -i grain-mysql sh -c 'exec mysql -uroot -p"$MYSQL_ROOT_PASSWORD" graintracker'</w:t>
+      </w:r>
+    </w:p>
+    <w:p>
+      <w:pPr>
+        <w:spacing w:after="120"/>
+      </w:pPr>
     </w:p>
     <w:p>
       <w:pPr>

</xml_diff>